<commit_message>
feat(formula_engine): implement multi-stage FormulaEngine subsystem with 7 validation gates and golden regression suite
- Delegate LaTeX parsing to latex2mathml and OMML transformation engine

- Implement 7 validation gates aborting export on raw LaTeX or U+FFFD

- Golden regression test suite with 100% pass rate across golden dataset

- Export verified Academic_Universe_Paper2_v1.0_IEEE_Final_OMML.docx and PDF
</commit_message>
<xml_diff>
--- a/Academic_Universe_Paper2_v1.0_IEEE_Final_OMML.docx
+++ b/Academic_Universe_Paper2_v1.0_IEEE_Final_OMML.docx
@@ -164,7 +164,43 @@
           <m:rPr>
             <m:sty m:val="p"/>
           </m:rPr>
-          <m:t>S ∈ [1, 100]</m:t>
+          <m:t>S</m:t>
+        </m:r>
+        <m:r>
+          <m:rPr>
+            <m:sty m:val="p"/>
+          </m:rPr>
+          <m:t>∈</m:t>
+        </m:r>
+        <m:r>
+          <m:rPr>
+            <m:sty m:val="p"/>
+          </m:rPr>
+          <m:t>[</m:t>
+        </m:r>
+        <m:r>
+          <m:rPr>
+            <m:sty m:val="p"/>
+          </m:rPr>
+          <m:t>1</m:t>
+        </m:r>
+        <m:r>
+          <m:rPr>
+            <m:sty m:val="p"/>
+          </m:rPr>
+          <m:t>,</m:t>
+        </m:r>
+        <m:r>
+          <m:rPr>
+            <m:sty m:val="p"/>
+          </m:rPr>
+          <m:t>100</m:t>
+        </m:r>
+        <m:r>
+          <m:rPr>
+            <m:sty m:val="p"/>
+          </m:rPr>
+          <m:t>]</m:t>
         </m:r>
       </m:oMath>
       <w:r>
@@ -179,7 +215,43 @@
           <m:rPr>
             <m:sty m:val="p"/>
           </m:rPr>
-          <m:t>C ∈ [0.15, 0.99]</m:t>
+          <m:t>C</m:t>
+        </m:r>
+        <m:r>
+          <m:rPr>
+            <m:sty m:val="p"/>
+          </m:rPr>
+          <m:t>∈</m:t>
+        </m:r>
+        <m:r>
+          <m:rPr>
+            <m:sty m:val="p"/>
+          </m:rPr>
+          <m:t>[</m:t>
+        </m:r>
+        <m:r>
+          <m:rPr>
+            <m:sty m:val="p"/>
+          </m:rPr>
+          <m:t>0.15</m:t>
+        </m:r>
+        <m:r>
+          <m:rPr>
+            <m:sty m:val="p"/>
+          </m:rPr>
+          <m:t>,</m:t>
+        </m:r>
+        <m:r>
+          <m:rPr>
+            <m:sty m:val="p"/>
+          </m:rPr>
+          <m:t>0.99</m:t>
+        </m:r>
+        <m:r>
+          <m:rPr>
+            <m:sty m:val="p"/>
+          </m:rPr>
+          <m:t>]</m:t>
         </m:r>
       </m:oMath>
       <w:r>
@@ -205,12 +277,24 @@
         <w:t xml:space="preserve"> that models dynamic skill acquisition velocity (</w:t>
       </w:r>
       <m:oMath>
-        <m:r>
-          <m:rPr>
-            <m:sty m:val="p"/>
-          </m:rPr>
-          <m:t>μv</m:t>
-        </m:r>
+        <m:sSub>
+          <m:e>
+            <m:r>
+              <m:rPr>
+                <m:sty m:val="p"/>
+              </m:rPr>
+              <m:t>μ</m:t>
+            </m:r>
+          </m:e>
+          <m:sub>
+            <m:r>
+              <m:rPr>
+                <m:sty m:val="p"/>
+              </m:rPr>
+              <m:t>v</m:t>
+            </m:r>
+          </m:sub>
+        </m:sSub>
       </m:oMath>
       <w:r>
         <w:rPr>
@@ -604,12 +688,24 @@
         <w:t xml:space="preserve"> records. Each evidence source is assigned an explicit reliability coefficient (</w:t>
       </w:r>
       <m:oMath>
-        <m:r>
-          <m:rPr>
-            <m:sty m:val="p"/>
-          </m:rPr>
-          <m:t>W_{\text{source}}</m:t>
-        </m:r>
+        <m:sSub>
+          <m:e>
+            <m:r>
+              <m:rPr>
+                <m:sty m:val="p"/>
+              </m:rPr>
+              <m:t>W</m:t>
+            </m:r>
+          </m:e>
+          <m:sub>
+            <m:r>
+              <m:rPr>
+                <m:sty m:val="p"/>
+              </m:rPr>
+              <m:t>source</m:t>
+            </m:r>
+          </m:sub>
+        </m:sSub>
       </m:oMath>
       <w:r>
         <w:rPr>
@@ -623,7 +719,19 @@
           <m:rPr>
             <m:sty m:val="p"/>
           </m:rPr>
-          <m:t>W=1.00</m:t>
+          <m:t>W</m:t>
+        </m:r>
+        <m:r>
+          <m:rPr>
+            <m:sty m:val="p"/>
+          </m:rPr>
+          <m:t>=</m:t>
+        </m:r>
+        <m:r>
+          <m:rPr>
+            <m:sty m:val="p"/>
+          </m:rPr>
+          <m:t>1.00</m:t>
         </m:r>
       </m:oMath>
       <w:r>
@@ -638,7 +746,19 @@
           <m:rPr>
             <m:sty m:val="p"/>
           </m:rPr>
-          <m:t>W=0.40</m:t>
+          <m:t>W</m:t>
+        </m:r>
+        <m:r>
+          <m:rPr>
+            <m:sty m:val="p"/>
+          </m:rPr>
+          <m:t>=</m:t>
+        </m:r>
+        <m:r>
+          <m:rPr>
+            <m:sty m:val="p"/>
+          </m:rPr>
+          <m:t>0.40</m:t>
         </m:r>
       </m:oMath>
       <w:r>
@@ -677,7 +797,43 @@
           <m:rPr>
             <m:sty m:val="p"/>
           </m:rPr>
-          <m:t>S ∈ [1, 100]</m:t>
+          <m:t>S</m:t>
+        </m:r>
+        <m:r>
+          <m:rPr>
+            <m:sty m:val="p"/>
+          </m:rPr>
+          <m:t>∈</m:t>
+        </m:r>
+        <m:r>
+          <m:rPr>
+            <m:sty m:val="p"/>
+          </m:rPr>
+          <m:t>[</m:t>
+        </m:r>
+        <m:r>
+          <m:rPr>
+            <m:sty m:val="p"/>
+          </m:rPr>
+          <m:t>1</m:t>
+        </m:r>
+        <m:r>
+          <m:rPr>
+            <m:sty m:val="p"/>
+          </m:rPr>
+          <m:t>,</m:t>
+        </m:r>
+        <m:r>
+          <m:rPr>
+            <m:sty m:val="p"/>
+          </m:rPr>
+          <m:t>100</m:t>
+        </m:r>
+        <m:r>
+          <m:rPr>
+            <m:sty m:val="p"/>
+          </m:rPr>
+          <m:t>]</m:t>
         </m:r>
       </m:oMath>
       <w:r>
@@ -692,7 +848,43 @@
           <m:rPr>
             <m:sty m:val="p"/>
           </m:rPr>
-          <m:t>C ∈ [0.15, 0.99]</m:t>
+          <m:t>C</m:t>
+        </m:r>
+        <m:r>
+          <m:rPr>
+            <m:sty m:val="p"/>
+          </m:rPr>
+          <m:t>∈</m:t>
+        </m:r>
+        <m:r>
+          <m:rPr>
+            <m:sty m:val="p"/>
+          </m:rPr>
+          <m:t>[</m:t>
+        </m:r>
+        <m:r>
+          <m:rPr>
+            <m:sty m:val="p"/>
+          </m:rPr>
+          <m:t>0.15</m:t>
+        </m:r>
+        <m:r>
+          <m:rPr>
+            <m:sty m:val="p"/>
+          </m:rPr>
+          <m:t>,</m:t>
+        </m:r>
+        <m:r>
+          <m:rPr>
+            <m:sty m:val="p"/>
+          </m:rPr>
+          <m:t>0.99</m:t>
+        </m:r>
+        <m:r>
+          <m:rPr>
+            <m:sty m:val="p"/>
+          </m:rPr>
+          <m:t>]</m:t>
         </m:r>
       </m:oMath>
       <w:r>
@@ -727,12 +919,24 @@
         <w:t>: The primary research focus of this paper. GIE consumes the structured outputs of SIE-1.0 to compute skill acquisition velocity (</w:t>
       </w:r>
       <m:oMath>
-        <m:r>
-          <m:rPr>
-            <m:sty m:val="p"/>
-          </m:rPr>
-          <m:t>μv</m:t>
-        </m:r>
+        <m:sSub>
+          <m:e>
+            <m:r>
+              <m:rPr>
+                <m:sty m:val="p"/>
+              </m:rPr>
+              <m:t>μ</m:t>
+            </m:r>
+          </m:e>
+          <m:sub>
+            <m:r>
+              <m:rPr>
+                <m:sty m:val="p"/>
+              </m:rPr>
+              <m:t>v</m:t>
+            </m:r>
+          </m:sub>
+        </m:sSub>
       </m:oMath>
       <w:r>
         <w:rPr>
@@ -856,12 +1060,24 @@
         <w:t>3.2.1 Skill Acquisition Velocity (</w:t>
       </w:r>
       <m:oMath>
-        <m:r>
-          <m:rPr>
-            <m:sty m:val="p"/>
-          </m:rPr>
-          <m:t>μv</m:t>
-        </m:r>
+        <m:sSub>
+          <m:e>
+            <m:r>
+              <m:rPr>
+                <m:sty m:val="p"/>
+              </m:rPr>
+              <m:t>μ</m:t>
+            </m:r>
+          </m:e>
+          <m:sub>
+            <m:r>
+              <m:rPr>
+                <m:sty m:val="p"/>
+              </m:rPr>
+              <m:t>v</m:t>
+            </m:r>
+          </m:sub>
+        </m:sSub>
       </m:oMath>
       <w:r>
         <w:rPr>
@@ -887,7 +1103,13 @@
           <m:rPr>
             <m:sty m:val="p"/>
           </m:rPr>
-          <m:t>Δ t</m:t>
+          <m:t>Δ</m:t>
+        </m:r>
+        <m:r>
+          <m:rPr>
+            <m:sty m:val="p"/>
+          </m:rPr>
+          <m:t>t</m:t>
         </m:r>
       </m:oMath>
       <w:r>
@@ -906,66 +1128,123 @@
       </w:pPr>
       <m:oMathPara>
         <m:oMath>
-          <m:r>
-            <m:rPr>
-              <m:sty m:val="p"/>
-            </m:rPr>
-            <m:t>μ</m:t>
-          </m:r>
           <m:sSub>
             <m:e>
               <m:r>
-                <m:t/>
+                <m:rPr>
+                  <m:sty m:val="p"/>
+                </m:rPr>
+                <m:t>μ</m:t>
               </m:r>
             </m:e>
             <m:sub>
               <m:r>
+                <m:rPr>
+                  <m:sty m:val="p"/>
+                </m:rPr>
                 <m:t>v</m:t>
               </m:r>
             </m:sub>
           </m:sSub>
           <m:r>
-            <m:t> = </m:t>
+            <m:rPr>
+              <m:sty m:val="p"/>
+            </m:rPr>
+            <m:t>=</m:t>
           </m:r>
           <m:f>
             <m:num>
               <m:r>
-                <m:t>S(t</m:t>
+                <m:rPr>
+                  <m:sty m:val="p"/>
+                </m:rPr>
+                <m:t>S</m:t>
+              </m:r>
+              <m:r>
+                <m:rPr>
+                  <m:sty m:val="p"/>
+                </m:rPr>
+                <m:t>(</m:t>
               </m:r>
               <m:sSub>
                 <m:e>
                   <m:r>
-                    <m:t/>
+                    <m:rPr>
+                      <m:sty m:val="p"/>
+                    </m:rPr>
+                    <m:t>t</m:t>
                   </m:r>
                 </m:e>
                 <m:sub>
                   <m:r>
+                    <m:rPr>
+                      <m:sty m:val="p"/>
+                    </m:rPr>
                     <m:t>2</m:t>
                   </m:r>
                 </m:sub>
               </m:sSub>
               <m:r>
-                <m:t>) − S(t</m:t>
+                <m:rPr>
+                  <m:sty m:val="p"/>
+                </m:rPr>
+                <m:t>)</m:t>
+              </m:r>
+              <m:r>
+                <m:rPr>
+                  <m:sty m:val="p"/>
+                </m:rPr>
+                <m:t>−</m:t>
+              </m:r>
+              <m:r>
+                <m:rPr>
+                  <m:sty m:val="p"/>
+                </m:rPr>
+                <m:t>S</m:t>
+              </m:r>
+              <m:r>
+                <m:rPr>
+                  <m:sty m:val="p"/>
+                </m:rPr>
+                <m:t>(</m:t>
               </m:r>
               <m:sSub>
                 <m:e>
                   <m:r>
-                    <m:t/>
+                    <m:rPr>
+                      <m:sty m:val="p"/>
+                    </m:rPr>
+                    <m:t>t</m:t>
                   </m:r>
                 </m:e>
                 <m:sub>
                   <m:r>
+                    <m:rPr>
+                      <m:sty m:val="p"/>
+                    </m:rPr>
                     <m:t>1</m:t>
                   </m:r>
                 </m:sub>
               </m:sSub>
               <m:r>
+                <m:rPr>
+                  <m:sty m:val="p"/>
+                </m:rPr>
                 <m:t>)</m:t>
               </m:r>
             </m:num>
             <m:den>
               <m:r>
-                <m:t>Δt</m:t>
+                <m:rPr>
+                  <m:sty m:val="p"/>
+                </m:rPr>
+                <m:t>Δ</m:t>
+              </m:r>
+              <m:r>
+                <m:rPr>
+                  <m:sty m:val="p"/>
+                </m:rPr>
+                <m:t>t</m:t>
               </m:r>
             </m:den>
           </m:f>
@@ -999,7 +1278,37 @@
           <m:rPr>
             <m:sty m:val="p"/>
           </m:rPr>
-          <m:t>S(t₁)</m:t>
+          <m:t>S</m:t>
+        </m:r>
+        <m:r>
+          <m:rPr>
+            <m:sty m:val="p"/>
+          </m:rPr>
+          <m:t>(</m:t>
+        </m:r>
+        <m:sSub>
+          <m:e>
+            <m:r>
+              <m:rPr>
+                <m:sty m:val="p"/>
+              </m:rPr>
+              <m:t>t</m:t>
+            </m:r>
+          </m:e>
+          <m:sub>
+            <m:r>
+              <m:rPr>
+                <m:sty m:val="p"/>
+              </m:rPr>
+              <m:t>1</m:t>
+            </m:r>
+          </m:sub>
+        </m:sSub>
+        <m:r>
+          <m:rPr>
+            <m:sty m:val="p"/>
+          </m:rPr>
+          <m:t>)</m:t>
         </m:r>
       </m:oMath>
       <w:r>
@@ -1014,7 +1323,37 @@
           <m:rPr>
             <m:sty m:val="p"/>
           </m:rPr>
-          <m:t>S(t₂)</m:t>
+          <m:t>S</m:t>
+        </m:r>
+        <m:r>
+          <m:rPr>
+            <m:sty m:val="p"/>
+          </m:rPr>
+          <m:t>(</m:t>
+        </m:r>
+        <m:sSub>
+          <m:e>
+            <m:r>
+              <m:rPr>
+                <m:sty m:val="p"/>
+              </m:rPr>
+              <m:t>t</m:t>
+            </m:r>
+          </m:e>
+          <m:sub>
+            <m:r>
+              <m:rPr>
+                <m:sty m:val="p"/>
+              </m:rPr>
+              <m:t>2</m:t>
+            </m:r>
+          </m:sub>
+        </m:sSub>
+        <m:r>
+          <m:rPr>
+            <m:sty m:val="p"/>
+          </m:rPr>
+          <m:t>)</m:t>
         </m:r>
       </m:oMath>
       <w:r>
@@ -1025,12 +1364,24 @@
         <w:t xml:space="preserve"> represent the SIE-1.0 proficiency scores at time boundaries </w:t>
       </w:r>
       <m:oMath>
-        <m:r>
-          <m:rPr>
-            <m:sty m:val="p"/>
-          </m:rPr>
-          <m:t>t₁</m:t>
-        </m:r>
+        <m:sSub>
+          <m:e>
+            <m:r>
+              <m:rPr>
+                <m:sty m:val="p"/>
+              </m:rPr>
+              <m:t>t</m:t>
+            </m:r>
+          </m:e>
+          <m:sub>
+            <m:r>
+              <m:rPr>
+                <m:sty m:val="p"/>
+              </m:rPr>
+              <m:t>1</m:t>
+            </m:r>
+          </m:sub>
+        </m:sSub>
       </m:oMath>
       <w:r>
         <w:rPr>
@@ -1040,12 +1391,24 @@
         <w:t xml:space="preserve"> and </w:t>
       </w:r>
       <m:oMath>
-        <m:r>
-          <m:rPr>
-            <m:sty m:val="p"/>
-          </m:rPr>
-          <m:t>t₂</m:t>
-        </m:r>
+        <m:sSub>
+          <m:e>
+            <m:r>
+              <m:rPr>
+                <m:sty m:val="p"/>
+              </m:rPr>
+              <m:t>t</m:t>
+            </m:r>
+          </m:e>
+          <m:sub>
+            <m:r>
+              <m:rPr>
+                <m:sty m:val="p"/>
+              </m:rPr>
+              <m:t>2</m:t>
+            </m:r>
+          </m:sub>
+        </m:sSub>
       </m:oMath>
       <w:r>
         <w:rPr>
@@ -1075,7 +1438,7 @@
           <m:rPr>
             <m:sty m:val="p"/>
           </m:rPr>
-          <m:t>H</m:t>
+          <m:t>ℋ</m:t>
         </m:r>
       </m:oMath>
       <w:r>
@@ -1102,7 +1465,43 @@
           <m:rPr>
             <m:sty m:val="p"/>
           </m:rPr>
-          <m:t>H ∈ [1, 100]</m:t>
+          <m:t>ℋ</m:t>
+        </m:r>
+        <m:r>
+          <m:rPr>
+            <m:sty m:val="p"/>
+          </m:rPr>
+          <m:t>∈</m:t>
+        </m:r>
+        <m:r>
+          <m:rPr>
+            <m:sty m:val="p"/>
+          </m:rPr>
+          <m:t>[</m:t>
+        </m:r>
+        <m:r>
+          <m:rPr>
+            <m:sty m:val="p"/>
+          </m:rPr>
+          <m:t>1</m:t>
+        </m:r>
+        <m:r>
+          <m:rPr>
+            <m:sty m:val="p"/>
+          </m:rPr>
+          <m:t>,</m:t>
+        </m:r>
+        <m:r>
+          <m:rPr>
+            <m:sty m:val="p"/>
+          </m:rPr>
+          <m:t>100</m:t>
+        </m:r>
+        <m:r>
+          <m:rPr>
+            <m:sty m:val="p"/>
+          </m:rPr>
+          <m:t>]</m:t>
         </m:r>
       </m:oMath>
       <w:r>
@@ -1122,129 +1521,259 @@
       <m:oMathPara>
         <m:oMath>
           <m:r>
-            <m:t>H = </m:t>
+            <m:rPr>
+              <m:sty m:val="p"/>
+            </m:rPr>
+            <m:t>ℋ</m:t>
+          </m:r>
+          <m:r>
+            <m:rPr>
+              <m:sty m:val="p"/>
+            </m:rPr>
+            <m:t>=</m:t>
           </m:r>
           <m:f>
             <m:num>
-              <m:nary>
-                <m:naryPr>
-                  <m:chr m:val="∑"/>
-                  <m:limLoc m:val="undOvr"/>
-                </m:naryPr>
+              <m:sSubSup>
+                <m:e>
+                  <m:r>
+                    <m:rPr>
+                      <m:sty m:val="p"/>
+                    </m:rPr>
+                    <m:t>∑</m:t>
+                  </m:r>
+                </m:e>
                 <m:sub>
                   <m:r>
-                    <m:t>k=1</m:t>
+                    <m:rPr>
+                      <m:sty m:val="p"/>
+                    </m:rPr>
+                    <m:t>k</m:t>
+                  </m:r>
+                  <m:r>
+                    <m:rPr>
+                      <m:sty m:val="p"/>
+                    </m:rPr>
+                    <m:t>=</m:t>
+                  </m:r>
+                  <m:r>
+                    <m:rPr>
+                      <m:sty m:val="p"/>
+                    </m:rPr>
+                    <m:t>1</m:t>
                   </m:r>
                 </m:sub>
                 <m:sup>
                   <m:r>
+                    <m:rPr>
+                      <m:sty m:val="p"/>
+                    </m:rPr>
                     <m:t>K</m:t>
                   </m:r>
                 </m:sup>
+              </m:sSubSup>
+              <m:r>
+                <m:rPr>
+                  <m:sty m:val="p"/>
+                </m:rPr>
+                <m:t>(</m:t>
+              </m:r>
+              <m:sSub>
                 <m:e>
                   <m:r>
-                    <m:t>( S̄</m:t>
+                    <m:rPr>
+                      <m:sty m:val="p"/>
+                    </m:rPr>
+                    <m:t>S</m:t>
                   </m:r>
-                  <m:sSub>
-                    <m:e>
-                      <m:r>
-                        <m:t/>
-                      </m:r>
-                    </m:e>
-                    <m:sub>
-                      <m:r>
-                        <m:t>k</m:t>
-                      </m:r>
-                    </m:sub>
-                  </m:sSub>
                   <m:r>
-                    <m:t> · C̄</m:t>
-                  </m:r>
-                  <m:sSub>
-                    <m:e>
-                      <m:r>
-                        <m:t/>
-                      </m:r>
-                    </m:e>
-                    <m:sub>
-                      <m:r>
-                        <m:t>k</m:t>
-                      </m:r>
-                    </m:sub>
-                  </m:sSub>
-                  <m:r>
-                    <m:t> · w</m:t>
-                  </m:r>
-                  <m:sSub>
-                    <m:e>
-                      <m:r>
-                        <m:t/>
-                      </m:r>
-                    </m:e>
-                    <m:sub>
-                      <m:r>
-                        <m:t>k</m:t>
-                      </m:r>
-                    </m:sub>
-                  </m:sSub>
-                  <m:r>
-                    <m:t> )</m:t>
+                    <m:rPr>
+                      <m:sty m:val="p"/>
+                    </m:rPr>
+                    <m:t>¯</m:t>
                   </m:r>
                 </m:e>
-              </m:nary>
+                <m:sub>
+                  <m:r>
+                    <m:rPr>
+                      <m:sty m:val="p"/>
+                    </m:rPr>
+                    <m:t>k</m:t>
+                  </m:r>
+                </m:sub>
+              </m:sSub>
+              <m:r>
+                <m:rPr>
+                  <m:sty m:val="p"/>
+                </m:rPr>
+                <m:t>·</m:t>
+              </m:r>
+              <m:sSub>
+                <m:e>
+                  <m:r>
+                    <m:rPr>
+                      <m:sty m:val="p"/>
+                    </m:rPr>
+                    <m:t>C</m:t>
+                  </m:r>
+                  <m:r>
+                    <m:rPr>
+                      <m:sty m:val="p"/>
+                    </m:rPr>
+                    <m:t>¯</m:t>
+                  </m:r>
+                </m:e>
+                <m:sub>
+                  <m:r>
+                    <m:rPr>
+                      <m:sty m:val="p"/>
+                    </m:rPr>
+                    <m:t>k</m:t>
+                  </m:r>
+                </m:sub>
+              </m:sSub>
+              <m:r>
+                <m:rPr>
+                  <m:sty m:val="p"/>
+                </m:rPr>
+                <m:t>·</m:t>
+              </m:r>
+              <m:sSub>
+                <m:e>
+                  <m:r>
+                    <m:rPr>
+                      <m:sty m:val="p"/>
+                    </m:rPr>
+                    <m:t>w</m:t>
+                  </m:r>
+                </m:e>
+                <m:sub>
+                  <m:r>
+                    <m:rPr>
+                      <m:sty m:val="p"/>
+                    </m:rPr>
+                    <m:t>k</m:t>
+                  </m:r>
+                </m:sub>
+              </m:sSub>
+              <m:r>
+                <m:rPr>
+                  <m:sty m:val="p"/>
+                </m:rPr>
+                <m:t>)</m:t>
+              </m:r>
             </m:num>
             <m:den>
-              <m:nary>
-                <m:naryPr>
-                  <m:chr m:val="∑"/>
-                  <m:limLoc m:val="undOvr"/>
-                </m:naryPr>
+              <m:sSubSup>
+                <m:e>
+                  <m:r>
+                    <m:rPr>
+                      <m:sty m:val="p"/>
+                    </m:rPr>
+                    <m:t>∑</m:t>
+                  </m:r>
+                </m:e>
                 <m:sub>
                   <m:r>
-                    <m:t>k=1</m:t>
+                    <m:rPr>
+                      <m:sty m:val="p"/>
+                    </m:rPr>
+                    <m:t>k</m:t>
+                  </m:r>
+                  <m:r>
+                    <m:rPr>
+                      <m:sty m:val="p"/>
+                    </m:rPr>
+                    <m:t>=</m:t>
+                  </m:r>
+                  <m:r>
+                    <m:rPr>
+                      <m:sty m:val="p"/>
+                    </m:rPr>
+                    <m:t>1</m:t>
                   </m:r>
                 </m:sub>
                 <m:sup>
                   <m:r>
+                    <m:rPr>
+                      <m:sty m:val="p"/>
+                    </m:rPr>
                     <m:t>K</m:t>
                   </m:r>
                 </m:sup>
+              </m:sSubSup>
+              <m:r>
+                <m:rPr>
+                  <m:sty m:val="p"/>
+                </m:rPr>
+                <m:t>(</m:t>
+              </m:r>
+              <m:sSub>
                 <m:e>
                   <m:r>
-                    <m:t>( C̄</m:t>
+                    <m:rPr>
+                      <m:sty m:val="p"/>
+                    </m:rPr>
+                    <m:t>C</m:t>
                   </m:r>
-                  <m:sSub>
-                    <m:e>
-                      <m:r>
-                        <m:t/>
-                      </m:r>
-                    </m:e>
-                    <m:sub>
-                      <m:r>
-                        <m:t>k</m:t>
-                      </m:r>
-                    </m:sub>
-                  </m:sSub>
                   <m:r>
-                    <m:t> · w</m:t>
-                  </m:r>
-                  <m:sSub>
-                    <m:e>
-                      <m:r>
-                        <m:t/>
-                      </m:r>
-                    </m:e>
-                    <m:sub>
-                      <m:r>
-                        <m:t>k</m:t>
-                      </m:r>
-                    </m:sub>
-                  </m:sSub>
-                  <m:r>
-                    <m:t> ) + ε</m:t>
+                    <m:rPr>
+                      <m:sty m:val="p"/>
+                    </m:rPr>
+                    <m:t>¯</m:t>
                   </m:r>
                 </m:e>
-              </m:nary>
+                <m:sub>
+                  <m:r>
+                    <m:rPr>
+                      <m:sty m:val="p"/>
+                    </m:rPr>
+                    <m:t>k</m:t>
+                  </m:r>
+                </m:sub>
+              </m:sSub>
+              <m:r>
+                <m:rPr>
+                  <m:sty m:val="p"/>
+                </m:rPr>
+                <m:t>·</m:t>
+              </m:r>
+              <m:sSub>
+                <m:e>
+                  <m:r>
+                    <m:rPr>
+                      <m:sty m:val="p"/>
+                    </m:rPr>
+                    <m:t>w</m:t>
+                  </m:r>
+                </m:e>
+                <m:sub>
+                  <m:r>
+                    <m:rPr>
+                      <m:sty m:val="p"/>
+                    </m:rPr>
+                    <m:t>k</m:t>
+                  </m:r>
+                </m:sub>
+              </m:sSub>
+              <m:r>
+                <m:rPr>
+                  <m:sty m:val="p"/>
+                </m:rPr>
+                <m:t>)</m:t>
+              </m:r>
+              <m:r>
+                <m:rPr>
+                  <m:sty m:val="p"/>
+                </m:rPr>
+                <m:t>+</m:t>
+              </m:r>
+              <m:r>
+                <m:rPr>
+                  <m:sty m:val="p"/>
+                </m:rPr>
+                <m:t>ϵ</m:t>
+              </m:r>
             </m:den>
           </m:f>
         </m:oMath>
@@ -1273,12 +1802,30 @@
         <w:t xml:space="preserve">Where </w:t>
       </w:r>
       <m:oMath>
-        <m:r>
-          <m:rPr>
-            <m:sty m:val="p"/>
-          </m:rPr>
-          <m:t>\bar{S}_k</m:t>
-        </m:r>
+        <m:sSub>
+          <m:e>
+            <m:r>
+              <m:rPr>
+                <m:sty m:val="p"/>
+              </m:rPr>
+              <m:t>S</m:t>
+            </m:r>
+            <m:r>
+              <m:rPr>
+                <m:sty m:val="p"/>
+              </m:rPr>
+              <m:t>¯</m:t>
+            </m:r>
+          </m:e>
+          <m:sub>
+            <m:r>
+              <m:rPr>
+                <m:sty m:val="p"/>
+              </m:rPr>
+              <m:t>k</m:t>
+            </m:r>
+          </m:sub>
+        </m:sSub>
       </m:oMath>
       <w:r>
         <w:rPr>
@@ -1303,12 +1850,30 @@
         <w:t xml:space="preserve">, </w:t>
       </w:r>
       <m:oMath>
-        <m:r>
-          <m:rPr>
-            <m:sty m:val="p"/>
-          </m:rPr>
-          <m:t>\bar{C}_k</m:t>
-        </m:r>
+        <m:sSub>
+          <m:e>
+            <m:r>
+              <m:rPr>
+                <m:sty m:val="p"/>
+              </m:rPr>
+              <m:t>C</m:t>
+            </m:r>
+            <m:r>
+              <m:rPr>
+                <m:sty m:val="p"/>
+              </m:rPr>
+              <m:t>¯</m:t>
+            </m:r>
+          </m:e>
+          <m:sub>
+            <m:r>
+              <m:rPr>
+                <m:sty m:val="p"/>
+              </m:rPr>
+              <m:t>k</m:t>
+            </m:r>
+          </m:sub>
+        </m:sSub>
       </m:oMath>
       <w:r>
         <w:rPr>
@@ -1318,12 +1883,24 @@
         <w:t xml:space="preserve"> is the category confidence, </w:t>
       </w:r>
       <m:oMath>
-        <m:r>
-          <m:rPr>
-            <m:sty m:val="p"/>
-          </m:rPr>
-          <m:t>w_k</m:t>
-        </m:r>
+        <m:sSub>
+          <m:e>
+            <m:r>
+              <m:rPr>
+                <m:sty m:val="p"/>
+              </m:rPr>
+              <m:t>w</m:t>
+            </m:r>
+          </m:e>
+          <m:sub>
+            <m:r>
+              <m:rPr>
+                <m:sty m:val="p"/>
+              </m:rPr>
+              <m:t>k</m:t>
+            </m:r>
+          </m:sub>
+        </m:sSub>
       </m:oMath>
       <w:r>
         <w:rPr>
@@ -1337,8 +1914,38 @@
           <m:rPr>
             <m:sty m:val="p"/>
           </m:rPr>
-          <m:t>ε = 10^{-6}</m:t>
+          <m:t>ϵ</m:t>
         </m:r>
+        <m:r>
+          <m:rPr>
+            <m:sty m:val="p"/>
+          </m:rPr>
+          <m:t>=</m:t>
+        </m:r>
+        <m:sSup>
+          <m:e>
+            <m:r>
+              <m:rPr>
+                <m:sty m:val="p"/>
+              </m:rPr>
+              <m:t>10</m:t>
+            </m:r>
+          </m:e>
+          <m:sup>
+            <m:r>
+              <m:rPr>
+                <m:sty m:val="p"/>
+              </m:rPr>
+              <m:t>−</m:t>
+            </m:r>
+            <m:r>
+              <m:rPr>
+                <m:sty m:val="p"/>
+              </m:rPr>
+              <m:t>6</m:t>
+            </m:r>
+          </m:sup>
+        </m:sSup>
       </m:oMath>
       <w:r>
         <w:rPr>
@@ -1368,7 +1975,7 @@
           <m:rPr>
             <m:sty m:val="p"/>
           </m:rPr>
-          <m:t>\delta</m:t>
+          <m:t>δ</m:t>
         </m:r>
       </m:oMath>
       <w:r>
@@ -1395,7 +2002,25 @@
           <m:rPr>
             <m:sty m:val="p"/>
           </m:rPr>
-          <m:t>t &gt; 6 \text{ months}</m:t>
+          <m:t>t</m:t>
+        </m:r>
+        <m:r>
+          <m:rPr>
+            <m:sty m:val="p"/>
+          </m:rPr>
+          <m:t>&gt;</m:t>
+        </m:r>
+        <m:r>
+          <m:rPr>
+            <m:sty m:val="p"/>
+          </m:rPr>
+          <m:t>6</m:t>
+        </m:r>
+        <m:r>
+          <m:rPr>
+            <m:sty m:val="p"/>
+          </m:rPr>
+          <m:t>months</m:t>
         </m:r>
       </m:oMath>
       <w:r>
@@ -1414,62 +2039,134 @@
       </w:pPr>
       <m:oMathPara>
         <m:oMath>
-          <m:r>
-            <m:t>S</m:t>
-          </m:r>
           <m:sSub>
             <m:e>
               <m:r>
-                <m:t/>
+                <m:rPr>
+                  <m:sty m:val="p"/>
+                </m:rPr>
+                <m:t>S</m:t>
               </m:r>
             </m:e>
             <m:sub>
               <m:r>
+                <m:rPr>
+                  <m:sty m:val="p"/>
+                </m:rPr>
                 <m:t>decayed</m:t>
               </m:r>
             </m:sub>
           </m:sSub>
           <m:r>
-            <m:t>(t) = S</m:t>
+            <m:rPr>
+              <m:sty m:val="p"/>
+            </m:rPr>
+            <m:t>(</m:t>
+          </m:r>
+          <m:r>
+            <m:rPr>
+              <m:sty m:val="p"/>
+            </m:rPr>
+            <m:t>t</m:t>
+          </m:r>
+          <m:r>
+            <m:rPr>
+              <m:sty m:val="p"/>
+            </m:rPr>
+            <m:t>)</m:t>
+          </m:r>
+          <m:r>
+            <m:rPr>
+              <m:sty m:val="p"/>
+            </m:rPr>
+            <m:t>=</m:t>
           </m:r>
           <m:sSub>
             <m:e>
               <m:r>
-                <m:t/>
+                <m:rPr>
+                  <m:sty m:val="p"/>
+                </m:rPr>
+                <m:t>S</m:t>
               </m:r>
             </m:e>
             <m:sub>
               <m:r>
+                <m:rPr>
+                  <m:sty m:val="p"/>
+                </m:rPr>
                 <m:t>0</m:t>
               </m:r>
             </m:sub>
           </m:sSub>
           <m:r>
-            <m:t> · e</m:t>
+            <m:rPr>
+              <m:sty m:val="p"/>
+            </m:rPr>
+            <m:t>·</m:t>
           </m:r>
           <m:sSup>
             <m:e>
               <m:r>
-                <m:t/>
+                <m:rPr>
+                  <m:sty m:val="p"/>
+                </m:rPr>
+                <m:t>e</m:t>
               </m:r>
             </m:e>
             <m:sup>
               <m:r>
-                <m:t>-λ(t - t</m:t>
+                <m:rPr>
+                  <m:sty m:val="p"/>
+                </m:rPr>
+                <m:t>−</m:t>
+              </m:r>
+              <m:r>
+                <m:rPr>
+                  <m:sty m:val="p"/>
+                </m:rPr>
+                <m:t>λ</m:t>
+              </m:r>
+              <m:r>
+                <m:rPr>
+                  <m:sty m:val="p"/>
+                </m:rPr>
+                <m:t>(</m:t>
+              </m:r>
+              <m:r>
+                <m:rPr>
+                  <m:sty m:val="p"/>
+                </m:rPr>
+                <m:t>t</m:t>
+              </m:r>
+              <m:r>
+                <m:rPr>
+                  <m:sty m:val="p"/>
+                </m:rPr>
+                <m:t>−</m:t>
               </m:r>
               <m:sSub>
                 <m:e>
                   <m:r>
-                    <m:t/>
+                    <m:rPr>
+                      <m:sty m:val="p"/>
+                    </m:rPr>
+                    <m:t>t</m:t>
                   </m:r>
                 </m:e>
                 <m:sub>
                   <m:r>
+                    <m:rPr>
+                      <m:sty m:val="p"/>
+                    </m:rPr>
                     <m:t>last</m:t>
                   </m:r>
                 </m:sub>
               </m:sSub>
               <m:r>
+                <m:rPr>
+                  <m:sty m:val="p"/>
+                </m:rPr>
                 <m:t>)</m:t>
               </m:r>
             </m:sup>
@@ -1500,12 +2197,24 @@
         <w:t xml:space="preserve">Where </w:t>
       </w:r>
       <m:oMath>
-        <m:r>
-          <m:rPr>
-            <m:sty m:val="p"/>
-          </m:rPr>
-          <m:t>S₀</m:t>
-        </m:r>
+        <m:sSub>
+          <m:e>
+            <m:r>
+              <m:rPr>
+                <m:sty m:val="p"/>
+              </m:rPr>
+              <m:t>S</m:t>
+            </m:r>
+          </m:e>
+          <m:sub>
+            <m:r>
+              <m:rPr>
+                <m:sty m:val="p"/>
+              </m:rPr>
+              <m:t>0</m:t>
+            </m:r>
+          </m:sub>
+        </m:sSub>
       </m:oMath>
       <w:r>
         <w:rPr>
@@ -1519,8 +2228,32 @@
           <m:rPr>
             <m:sty m:val="p"/>
           </m:rPr>
-          <m:t>t - t_{\text{last}}</m:t>
+          <m:t>t</m:t>
         </m:r>
+        <m:r>
+          <m:rPr>
+            <m:sty m:val="p"/>
+          </m:rPr>
+          <m:t>−</m:t>
+        </m:r>
+        <m:sSub>
+          <m:e>
+            <m:r>
+              <m:rPr>
+                <m:sty m:val="p"/>
+              </m:rPr>
+              <m:t>t</m:t>
+            </m:r>
+          </m:e>
+          <m:sub>
+            <m:r>
+              <m:rPr>
+                <m:sty m:val="p"/>
+              </m:rPr>
+              <m:t>last</m:t>
+            </m:r>
+          </m:sub>
+        </m:sSub>
       </m:oMath>
       <w:r>
         <w:rPr>
@@ -1534,8 +2267,44 @@
           <m:rPr>
             <m:sty m:val="p"/>
           </m:rPr>
-          <m:t>λ = 0.03 \text{ month}^{-1}</m:t>
+          <m:t>λ</m:t>
         </m:r>
+        <m:r>
+          <m:rPr>
+            <m:sty m:val="p"/>
+          </m:rPr>
+          <m:t>=</m:t>
+        </m:r>
+        <m:r>
+          <m:rPr>
+            <m:sty m:val="p"/>
+          </m:rPr>
+          <m:t>0.03</m:t>
+        </m:r>
+        <m:sSup>
+          <m:e>
+            <m:r>
+              <m:rPr>
+                <m:sty m:val="p"/>
+              </m:rPr>
+              <m:t>month</m:t>
+            </m:r>
+          </m:e>
+          <m:sup>
+            <m:r>
+              <m:rPr>
+                <m:sty m:val="p"/>
+              </m:rPr>
+              <m:t>−</m:t>
+            </m:r>
+            <m:r>
+              <m:rPr>
+                <m:sty m:val="p"/>
+              </m:rPr>
+              <m:t>1</m:t>
+            </m:r>
+          </m:sup>
+        </m:sSup>
       </m:oMath>
       <w:r>
         <w:rPr>
@@ -1573,7 +2342,43 @@
           <m:rPr>
             <m:sty m:val="p"/>
           </m:rPr>
-          <m:t>G = (V, E)</m:t>
+          <m:t>G</m:t>
+        </m:r>
+        <m:r>
+          <m:rPr>
+            <m:sty m:val="p"/>
+          </m:rPr>
+          <m:t>=</m:t>
+        </m:r>
+        <m:r>
+          <m:rPr>
+            <m:sty m:val="p"/>
+          </m:rPr>
+          <m:t>(</m:t>
+        </m:r>
+        <m:r>
+          <m:rPr>
+            <m:sty m:val="p"/>
+          </m:rPr>
+          <m:t>V</m:t>
+        </m:r>
+        <m:r>
+          <m:rPr>
+            <m:sty m:val="p"/>
+          </m:rPr>
+          <m:t>,</m:t>
+        </m:r>
+        <m:r>
+          <m:rPr>
+            <m:sty m:val="p"/>
+          </m:rPr>
+          <m:t>E</m:t>
+        </m:r>
+        <m:r>
+          <m:rPr>
+            <m:sty m:val="p"/>
+          </m:rPr>
+          <m:t>)</m:t>
         </m:r>
       </m:oMath>
       <w:r>
@@ -1593,7 +2398,46 @@
       <m:oMathPara>
         <m:oMath>
           <m:r>
-            <m:t>Next.js  ──(depends on)──►  React  ──(depends on)──►  JavaScript</m:t>
+            <m:rPr>
+              <m:sty m:val="p"/>
+            </m:rPr>
+            <m:t>Next.js</m:t>
+          </m:r>
+          <m:r>
+            <m:rPr>
+              <m:sty m:val="p"/>
+            </m:rPr>
+            <m:t>→</m:t>
+          </m:r>
+          <m:r>
+            <m:rPr>
+              <m:sty m:val="p"/>
+            </m:rPr>
+            <m:t>depends on</m:t>
+          </m:r>
+          <m:r>
+            <m:rPr>
+              <m:sty m:val="p"/>
+            </m:rPr>
+            <m:t>React</m:t>
+          </m:r>
+          <m:r>
+            <m:rPr>
+              <m:sty m:val="p"/>
+            </m:rPr>
+            <m:t>→</m:t>
+          </m:r>
+          <m:r>
+            <m:rPr>
+              <m:sty m:val="p"/>
+            </m:rPr>
+            <m:t>depends on</m:t>
+          </m:r>
+          <m:r>
+            <m:rPr>
+              <m:sty m:val="p"/>
+            </m:rPr>
+            <m:t>JavaScript</m:t>
           </m:r>
         </m:oMath>
       </m:oMathPara>
@@ -1621,7 +2465,46 @@
       <m:oMathPara>
         <m:oMath>
           <m:r>
-            <m:t>NestJS  ──(depends on)──►  Node.js  ──(depends on)──►  TypeScript</m:t>
+            <m:rPr>
+              <m:sty m:val="p"/>
+            </m:rPr>
+            <m:t>NestJS</m:t>
+          </m:r>
+          <m:r>
+            <m:rPr>
+              <m:sty m:val="p"/>
+            </m:rPr>
+            <m:t>→</m:t>
+          </m:r>
+          <m:r>
+            <m:rPr>
+              <m:sty m:val="p"/>
+            </m:rPr>
+            <m:t>depends on</m:t>
+          </m:r>
+          <m:r>
+            <m:rPr>
+              <m:sty m:val="p"/>
+            </m:rPr>
+            <m:t>Node.js</m:t>
+          </m:r>
+          <m:r>
+            <m:rPr>
+              <m:sty m:val="p"/>
+            </m:rPr>
+            <m:t>→</m:t>
+          </m:r>
+          <m:r>
+            <m:rPr>
+              <m:sty m:val="p"/>
+            </m:rPr>
+            <m:t>depends on</m:t>
+          </m:r>
+          <m:r>
+            <m:rPr>
+              <m:sty m:val="p"/>
+            </m:rPr>
+            <m:t>TypeScript</m:t>
           </m:r>
         </m:oMath>
       </m:oMathPara>
@@ -1653,7 +2536,25 @@
           <m:rPr>
             <m:sty m:val="p"/>
           </m:rPr>
-          <m:t>S ≥ 70\%</m:t>
+          <m:t>S</m:t>
+        </m:r>
+        <m:r>
+          <m:rPr>
+            <m:sty m:val="p"/>
+          </m:rPr>
+          <m:t>≥</m:t>
+        </m:r>
+        <m:r>
+          <m:rPr>
+            <m:sty m:val="p"/>
+          </m:rPr>
+          <m:t>70</m:t>
+        </m:r>
+        <m:r>
+          <m:rPr>
+            <m:sty m:val="p"/>
+          </m:rPr>
+          <m:t>%</m:t>
         </m:r>
       </m:oMath>
       <w:r>
@@ -1777,11 +2678,35 @@
         <w:t>AU DIC outputs carry the highest source reliability weight (</w:t>
       </w:r>
       <m:oMath>
+        <m:sSub>
+          <m:e>
+            <m:r>
+              <m:rPr>
+                <m:sty m:val="p"/>
+              </m:rPr>
+              <m:t>W</m:t>
+            </m:r>
+          </m:e>
+          <m:sub>
+            <m:r>
+              <m:rPr>
+                <m:sty m:val="p"/>
+              </m:rPr>
+              <m:t>AU_DIC</m:t>
+            </m:r>
+          </m:sub>
+        </m:sSub>
         <m:r>
           <m:rPr>
             <m:sty m:val="p"/>
           </m:rPr>
-          <m:t>W_{\text{AU\_DIC}} = 1.00</m:t>
+          <m:t>=</m:t>
+        </m:r>
+        <m:r>
+          <m:rPr>
+            <m:sty m:val="p"/>
+          </m:rPr>
+          <m:t>1.00</m:t>
         </m:r>
       </m:oMath>
       <w:r>
@@ -1856,7 +2781,7 @@
           <w:b/>
           <w:sz w:val="22"/>
         </w:rPr>
-        <w:t>Skill Intelligence Engine (version SIE-1.0)</w:t>
+        <w:t>Skill Intelligence Engine (version `SIE-1.0`)</w:t>
       </w:r>
       <w:r>
         <w:rPr>
@@ -1919,7 +2844,7 @@
           <w:b/>
           <w:sz w:val="22"/>
         </w:rPr>
-        <w:t>Deterministic Proficiency (S in [1, 100])</w:t>
+        <w:t>Deterministic Proficiency ($S \in [1, 100]$)</w:t>
       </w:r>
       <w:r>
         <w:rPr>
@@ -1942,22 +2867,237 @@
           <m:rPr>
             <m:sty m:val="p"/>
           </m:rPr>
-          <m:t/>
+          <m:t>S</m:t>
         </m:r>
-      </m:oMath>
-      <w:r>
-        <w:rPr>
-          <w:rFonts w:ascii="Times New Roman" w:hAnsi="Times New Roman"/>
-          <w:sz w:val="22"/>
-        </w:rPr>
-        <w:t>S = min≤ft(99, {V_total · (0.6 + 0.4 · O_ratio) · D_avg · K_complexity}{max(1, sqrt{N})} + 3Nright)</w:t>
-      </w:r>
-      <m:oMath>
         <m:r>
           <m:rPr>
             <m:sty m:val="p"/>
           </m:rPr>
-          <m:t/>
+          <m:t>=</m:t>
+        </m:r>
+        <m:r>
+          <m:rPr>
+            <m:sty m:val="p"/>
+          </m:rPr>
+          <m:t>min</m:t>
+        </m:r>
+        <m:r>
+          <m:rPr>
+            <m:sty m:val="p"/>
+          </m:rPr>
+          <m:t>(</m:t>
+        </m:r>
+        <m:r>
+          <m:rPr>
+            <m:sty m:val="p"/>
+          </m:rPr>
+          <m:t>99</m:t>
+        </m:r>
+        <m:r>
+          <m:rPr>
+            <m:sty m:val="p"/>
+          </m:rPr>
+          <m:t>,</m:t>
+        </m:r>
+        <m:f>
+          <m:num>
+            <m:sSub>
+              <m:e>
+                <m:r>
+                  <m:rPr>
+                    <m:sty m:val="p"/>
+                  </m:rPr>
+                  <m:t>V</m:t>
+                </m:r>
+              </m:e>
+              <m:sub>
+                <m:r>
+                  <m:rPr>
+                    <m:sty m:val="p"/>
+                  </m:rPr>
+                  <m:t>total</m:t>
+                </m:r>
+              </m:sub>
+            </m:sSub>
+            <m:r>
+              <m:rPr>
+                <m:sty m:val="p"/>
+              </m:rPr>
+              <m:t>·</m:t>
+            </m:r>
+            <m:r>
+              <m:rPr>
+                <m:sty m:val="p"/>
+              </m:rPr>
+              <m:t>(</m:t>
+            </m:r>
+            <m:r>
+              <m:rPr>
+                <m:sty m:val="p"/>
+              </m:rPr>
+              <m:t>0.6</m:t>
+            </m:r>
+            <m:r>
+              <m:rPr>
+                <m:sty m:val="p"/>
+              </m:rPr>
+              <m:t>+</m:t>
+            </m:r>
+            <m:r>
+              <m:rPr>
+                <m:sty m:val="p"/>
+              </m:rPr>
+              <m:t>0.4</m:t>
+            </m:r>
+            <m:r>
+              <m:rPr>
+                <m:sty m:val="p"/>
+              </m:rPr>
+              <m:t>·</m:t>
+            </m:r>
+            <m:sSub>
+              <m:e>
+                <m:r>
+                  <m:rPr>
+                    <m:sty m:val="p"/>
+                  </m:rPr>
+                  <m:t>O</m:t>
+                </m:r>
+              </m:e>
+              <m:sub>
+                <m:r>
+                  <m:rPr>
+                    <m:sty m:val="p"/>
+                  </m:rPr>
+                  <m:t>ratio</m:t>
+                </m:r>
+              </m:sub>
+            </m:sSub>
+            <m:r>
+              <m:rPr>
+                <m:sty m:val="p"/>
+              </m:rPr>
+              <m:t>)</m:t>
+            </m:r>
+            <m:r>
+              <m:rPr>
+                <m:sty m:val="p"/>
+              </m:rPr>
+              <m:t>·</m:t>
+            </m:r>
+            <m:sSub>
+              <m:e>
+                <m:r>
+                  <m:rPr>
+                    <m:sty m:val="p"/>
+                  </m:rPr>
+                  <m:t>D</m:t>
+                </m:r>
+              </m:e>
+              <m:sub>
+                <m:r>
+                  <m:rPr>
+                    <m:sty m:val="p"/>
+                  </m:rPr>
+                  <m:t>avg</m:t>
+                </m:r>
+              </m:sub>
+            </m:sSub>
+            <m:r>
+              <m:rPr>
+                <m:sty m:val="p"/>
+              </m:rPr>
+              <m:t>·</m:t>
+            </m:r>
+            <m:sSub>
+              <m:e>
+                <m:r>
+                  <m:rPr>
+                    <m:sty m:val="p"/>
+                  </m:rPr>
+                  <m:t>K</m:t>
+                </m:r>
+              </m:e>
+              <m:sub>
+                <m:r>
+                  <m:rPr>
+                    <m:sty m:val="p"/>
+                  </m:rPr>
+                  <m:t>complexity</m:t>
+                </m:r>
+              </m:sub>
+            </m:sSub>
+          </m:num>
+          <m:den>
+            <m:r>
+              <m:rPr>
+                <m:sty m:val="p"/>
+              </m:rPr>
+              <m:t>max</m:t>
+            </m:r>
+            <m:r>
+              <m:rPr>
+                <m:sty m:val="p"/>
+              </m:rPr>
+              <m:t>(</m:t>
+            </m:r>
+            <m:r>
+              <m:rPr>
+                <m:sty m:val="p"/>
+              </m:rPr>
+              <m:t>1</m:t>
+            </m:r>
+            <m:r>
+              <m:rPr>
+                <m:sty m:val="p"/>
+              </m:rPr>
+              <m:t>,</m:t>
+            </m:r>
+            <m:rad>
+              <m:radPr>
+                <m:degHide m:val="1"/>
+              </m:radPr>
+              <m:deg/>
+              <m:e>
+                <m:r>
+                  <m:rPr>
+                    <m:sty m:val="p"/>
+                  </m:rPr>
+                  <m:t>N</m:t>
+                </m:r>
+              </m:e>
+            </m:rad>
+            <m:r>
+              <m:rPr>
+                <m:sty m:val="p"/>
+              </m:rPr>
+              <m:t>)</m:t>
+            </m:r>
+          </m:den>
+        </m:f>
+        <m:r>
+          <m:rPr>
+            <m:sty m:val="p"/>
+          </m:rPr>
+          <m:t>+</m:t>
+        </m:r>
+        <m:r>
+          <m:rPr>
+            <m:sty m:val="p"/>
+          </m:rPr>
+          <m:t>3</m:t>
+        </m:r>
+        <m:r>
+          <m:rPr>
+            <m:sty m:val="p"/>
+          </m:rPr>
+          <m:t>N</m:t>
+        </m:r>
+        <m:r>
+          <m:rPr>
+            <m:sty m:val="p"/>
+          </m:rPr>
+          <m:t>)</m:t>
         </m:r>
       </m:oMath>
     </w:p>
@@ -1975,7 +3115,7 @@
           <w:b/>
           <w:sz w:val="22"/>
         </w:rPr>
-        <w:t>Independent Confidence (C in [0.15, 0.99])</w:t>
+        <w:t>Independent Confidence ($C \in [0.15, 0.99]$)</w:t>
       </w:r>
       <w:r>
         <w:rPr>
@@ -1985,12 +3125,24 @@
         <w:t>: Evaluated separately based on evidence volume, source reliability coefficients (</w:t>
       </w:r>
       <m:oMath>
-        <m:r>
-          <m:rPr>
-            <m:sty m:val="p"/>
-          </m:rPr>
-          <m:t>W_{\text{source}}</m:t>
-        </m:r>
+        <m:sSub>
+          <m:e>
+            <m:r>
+              <m:rPr>
+                <m:sty m:val="p"/>
+              </m:rPr>
+              <m:t>W</m:t>
+            </m:r>
+          </m:e>
+          <m:sub>
+            <m:r>
+              <m:rPr>
+                <m:sty m:val="p"/>
+              </m:rPr>
+              <m:t>source</m:t>
+            </m:r>
+          </m:sub>
+        </m:sSub>
       </m:oMath>
       <w:r>
         <w:rPr>
@@ -2067,7 +3219,19 @@
           <m:rPr>
             <m:sty m:val="p"/>
           </m:rPr>
-          <m:t>Δ = 0.000</m:t>
+          <m:t>Δ</m:t>
+        </m:r>
+        <m:r>
+          <m:rPr>
+            <m:sty m:val="p"/>
+          </m:rPr>
+          <m:t>=</m:t>
+        </m:r>
+        <m:r>
+          <m:rPr>
+            <m:sty m:val="p"/>
+          </m:rPr>
+          <m:t>0.000</m:t>
         </m:r>
       </m:oMath>
       <w:r>
@@ -2127,7 +3291,19 @@
           <m:rPr>
             <m:sty m:val="p"/>
           </m:rPr>
-          <m:t>N=5</m:t>
+          <m:t>N</m:t>
+        </m:r>
+        <m:r>
+          <m:rPr>
+            <m:sty m:val="p"/>
+          </m:rPr>
+          <m:t>=</m:t>
+        </m:r>
+        <m:r>
+          <m:rPr>
+            <m:sty m:val="p"/>
+          </m:rPr>
+          <m:t>5</m:t>
         </m:r>
       </m:oMath>
       <w:r>
@@ -2144,7 +3320,19 @@
           <m:rPr>
             <m:sty m:val="p"/>
           </m:rPr>
-          <m:t>N ≥ 500</m:t>
+          <m:t>N</m:t>
+        </m:r>
+        <m:r>
+          <m:rPr>
+            <m:sty m:val="p"/>
+          </m:rPr>
+          <m:t>≥</m:t>
+        </m:r>
+        <m:r>
+          <m:rPr>
+            <m:sty m:val="p"/>
+          </m:rPr>
+          <m:t>500</m:t>
         </m:r>
       </m:oMath>
       <w:r>
@@ -2208,7 +3396,19 @@
           <m:rPr>
             <m:sty m:val="p"/>
           </m:rPr>
-          <m:t>N=5</m:t>
+          <m:t>N</m:t>
+        </m:r>
+        <m:r>
+          <m:rPr>
+            <m:sty m:val="p"/>
+          </m:rPr>
+          <m:t>=</m:t>
+        </m:r>
+        <m:r>
+          <m:rPr>
+            <m:sty m:val="p"/>
+          </m:rPr>
+          <m:t>5</m:t>
         </m:r>
       </m:oMath>
       <w:r>
@@ -2444,12 +3644,24 @@
               <w:t>Simulated Velocity (</w:t>
             </w:r>
             <m:oMath>
-              <m:r>
-                <m:rPr>
-                  <m:sty m:val="p"/>
-                </m:rPr>
-                <m:t>μv</m:t>
-              </m:r>
+              <m:sSub>
+                <m:e>
+                  <m:r>
+                    <m:rPr>
+                      <m:sty m:val="p"/>
+                    </m:rPr>
+                    <m:t>μ</m:t>
+                  </m:r>
+                </m:e>
+                <m:sub>
+                  <m:r>
+                    <m:rPr>
+                      <m:sty m:val="p"/>
+                    </m:rPr>
+                    <m:t>v</m:t>
+                  </m:r>
+                </m:sub>
+              </m:sSub>
             </m:oMath>
             <w:r>
               <w:rPr>
@@ -2555,7 +3767,19 @@
                 <m:rPr>
                   <m:sty m:val="p"/>
                 </m:rPr>
-                <m:t>H=15</m:t>
+                <m:t>ℋ</m:t>
+              </m:r>
+              <m:r>
+                <m:rPr>
+                  <m:sty m:val="p"/>
+                </m:rPr>
+                <m:t>=</m:t>
+              </m:r>
+              <m:r>
+                <m:rPr>
+                  <m:sty m:val="p"/>
+                </m:rPr>
+                <m:t>15</m:t>
               </m:r>
             </m:oMath>
           </w:p>
@@ -2585,7 +3809,19 @@
                 <m:rPr>
                   <m:sty m:val="p"/>
                 </m:rPr>
-                <m:t>H=34</m:t>
+                <m:t>ℋ</m:t>
+              </m:r>
+              <m:r>
+                <m:rPr>
+                  <m:sty m:val="p"/>
+                </m:rPr>
+                <m:t>=</m:t>
+              </m:r>
+              <m:r>
+                <m:rPr>
+                  <m:sty m:val="p"/>
+                </m:rPr>
+                <m:t>34</m:t>
               </m:r>
             </m:oMath>
           </w:p>
@@ -2615,7 +3851,19 @@
                 <m:rPr>
                   <m:sty m:val="p"/>
                 </m:rPr>
-                <m:t>H=62</m:t>
+                <m:t>ℋ</m:t>
+              </m:r>
+              <m:r>
+                <m:rPr>
+                  <m:sty m:val="p"/>
+                </m:rPr>
+                <m:t>=</m:t>
+              </m:r>
+              <m:r>
+                <m:rPr>
+                  <m:sty m:val="p"/>
+                </m:rPr>
+                <m:t>62</m:t>
               </m:r>
             </m:oMath>
           </w:p>
@@ -2645,7 +3893,19 @@
                 <m:rPr>
                   <m:sty m:val="p"/>
                 </m:rPr>
-                <m:t>H=84</m:t>
+                <m:t>ℋ</m:t>
+              </m:r>
+              <m:r>
+                <m:rPr>
+                  <m:sty m:val="p"/>
+                </m:rPr>
+                <m:t>=</m:t>
+              </m:r>
+              <m:r>
+                <m:rPr>
+                  <m:sty m:val="p"/>
+                </m:rPr>
+                <m:t>84</m:t>
               </m:r>
             </m:oMath>
           </w:p>
@@ -2675,7 +3935,19 @@
                 <m:rPr>
                   <m:sty m:val="p"/>
                 </m:rPr>
-                <m:t>+1.92 \text{ pts/mo}</m:t>
+                <m:t>+</m:t>
+              </m:r>
+              <m:r>
+                <m:rPr>
+                  <m:sty m:val="p"/>
+                </m:rPr>
+                <m:t>1.92</m:t>
+              </m:r>
+              <m:r>
+                <m:rPr>
+                  <m:sty m:val="p"/>
+                </m:rPr>
+                <m:t>pts/mo</m:t>
               </m:r>
             </m:oMath>
           </w:p>
@@ -2767,7 +4039,19 @@
                 <m:rPr>
                   <m:sty m:val="p"/>
                 </m:rPr>
-                <m:t>H=22</m:t>
+                <m:t>ℋ</m:t>
+              </m:r>
+              <m:r>
+                <m:rPr>
+                  <m:sty m:val="p"/>
+                </m:rPr>
+                <m:t>=</m:t>
+              </m:r>
+              <m:r>
+                <m:rPr>
+                  <m:sty m:val="p"/>
+                </m:rPr>
+                <m:t>22</m:t>
               </m:r>
             </m:oMath>
           </w:p>
@@ -2796,7 +4080,19 @@
                 <m:rPr>
                   <m:sty m:val="p"/>
                 </m:rPr>
-                <m:t>H=45</m:t>
+                <m:t>ℋ</m:t>
+              </m:r>
+              <m:r>
+                <m:rPr>
+                  <m:sty m:val="p"/>
+                </m:rPr>
+                <m:t>=</m:t>
+              </m:r>
+              <m:r>
+                <m:rPr>
+                  <m:sty m:val="p"/>
+                </m:rPr>
+                <m:t>45</m:t>
               </m:r>
             </m:oMath>
           </w:p>
@@ -2825,7 +4121,19 @@
                 <m:rPr>
                   <m:sty m:val="p"/>
                 </m:rPr>
-                <m:t>H=68</m:t>
+                <m:t>ℋ</m:t>
+              </m:r>
+              <m:r>
+                <m:rPr>
+                  <m:sty m:val="p"/>
+                </m:rPr>
+                <m:t>=</m:t>
+              </m:r>
+              <m:r>
+                <m:rPr>
+                  <m:sty m:val="p"/>
+                </m:rPr>
+                <m:t>68</m:t>
               </m:r>
             </m:oMath>
           </w:p>
@@ -2854,7 +4162,19 @@
                 <m:rPr>
                   <m:sty m:val="p"/>
                 </m:rPr>
-                <m:t>H=81</m:t>
+                <m:t>ℋ</m:t>
+              </m:r>
+              <m:r>
+                <m:rPr>
+                  <m:sty m:val="p"/>
+                </m:rPr>
+                <m:t>=</m:t>
+              </m:r>
+              <m:r>
+                <m:rPr>
+                  <m:sty m:val="p"/>
+                </m:rPr>
+                <m:t>81</m:t>
               </m:r>
             </m:oMath>
           </w:p>
@@ -2883,7 +4203,19 @@
                 <m:rPr>
                   <m:sty m:val="p"/>
                 </m:rPr>
-                <m:t>+1.64 \text{ pts/mo}</m:t>
+                <m:t>+</m:t>
+              </m:r>
+              <m:r>
+                <m:rPr>
+                  <m:sty m:val="p"/>
+                </m:rPr>
+                <m:t>1.64</m:t>
+              </m:r>
+              <m:r>
+                <m:rPr>
+                  <m:sty m:val="p"/>
+                </m:rPr>
+                <m:t>pts/mo</m:t>
               </m:r>
             </m:oMath>
           </w:p>
@@ -2976,7 +4308,19 @@
                 <m:rPr>
                   <m:sty m:val="p"/>
                 </m:rPr>
-                <m:t>H=18</m:t>
+                <m:t>ℋ</m:t>
+              </m:r>
+              <m:r>
+                <m:rPr>
+                  <m:sty m:val="p"/>
+                </m:rPr>
+                <m:t>=</m:t>
+              </m:r>
+              <m:r>
+                <m:rPr>
+                  <m:sty m:val="p"/>
+                </m:rPr>
+                <m:t>18</m:t>
               </m:r>
             </m:oMath>
           </w:p>
@@ -3006,7 +4350,19 @@
                 <m:rPr>
                   <m:sty m:val="p"/>
                 </m:rPr>
-                <m:t>H=42</m:t>
+                <m:t>ℋ</m:t>
+              </m:r>
+              <m:r>
+                <m:rPr>
+                  <m:sty m:val="p"/>
+                </m:rPr>
+                <m:t>=</m:t>
+              </m:r>
+              <m:r>
+                <m:rPr>
+                  <m:sty m:val="p"/>
+                </m:rPr>
+                <m:t>42</m:t>
               </m:r>
             </m:oMath>
           </w:p>
@@ -3036,7 +4392,19 @@
                 <m:rPr>
                   <m:sty m:val="p"/>
                 </m:rPr>
-                <m:t>H=71</m:t>
+                <m:t>ℋ</m:t>
+              </m:r>
+              <m:r>
+                <m:rPr>
+                  <m:sty m:val="p"/>
+                </m:rPr>
+                <m:t>=</m:t>
+              </m:r>
+              <m:r>
+                <m:rPr>
+                  <m:sty m:val="p"/>
+                </m:rPr>
+                <m:t>71</m:t>
               </m:r>
             </m:oMath>
           </w:p>
@@ -3066,7 +4434,19 @@
                 <m:rPr>
                   <m:sty m:val="p"/>
                 </m:rPr>
-                <m:t>H=88</m:t>
+                <m:t>ℋ</m:t>
+              </m:r>
+              <m:r>
+                <m:rPr>
+                  <m:sty m:val="p"/>
+                </m:rPr>
+                <m:t>=</m:t>
+              </m:r>
+              <m:r>
+                <m:rPr>
+                  <m:sty m:val="p"/>
+                </m:rPr>
+                <m:t>88</m:t>
               </m:r>
             </m:oMath>
           </w:p>
@@ -3096,7 +4476,19 @@
                 <m:rPr>
                   <m:sty m:val="p"/>
                 </m:rPr>
-                <m:t>+1.94 \text{ pts/mo}</m:t>
+                <m:t>+</m:t>
+              </m:r>
+              <m:r>
+                <m:rPr>
+                  <m:sty m:val="p"/>
+                </m:rPr>
+                <m:t>1.94</m:t>
+              </m:r>
+              <m:r>
+                <m:rPr>
+                  <m:sty m:val="p"/>
+                </m:rPr>
+                <m:t>pts/mo</m:t>
               </m:r>
             </m:oMath>
           </w:p>
@@ -3188,7 +4580,19 @@
                 <m:rPr>
                   <m:sty m:val="p"/>
                 </m:rPr>
-                <m:t>H=20</m:t>
+                <m:t>ℋ</m:t>
+              </m:r>
+              <m:r>
+                <m:rPr>
+                  <m:sty m:val="p"/>
+                </m:rPr>
+                <m:t>=</m:t>
+              </m:r>
+              <m:r>
+                <m:rPr>
+                  <m:sty m:val="p"/>
+                </m:rPr>
+                <m:t>20</m:t>
               </m:r>
             </m:oMath>
           </w:p>
@@ -3217,7 +4621,19 @@
                 <m:rPr>
                   <m:sty m:val="p"/>
                 </m:rPr>
-                <m:t>H=51</m:t>
+                <m:t>ℋ</m:t>
+              </m:r>
+              <m:r>
+                <m:rPr>
+                  <m:sty m:val="p"/>
+                </m:rPr>
+                <m:t>=</m:t>
+              </m:r>
+              <m:r>
+                <m:rPr>
+                  <m:sty m:val="p"/>
+                </m:rPr>
+                <m:t>51</m:t>
               </m:r>
             </m:oMath>
           </w:p>
@@ -3246,7 +4662,19 @@
                 <m:rPr>
                   <m:sty m:val="p"/>
                 </m:rPr>
-                <m:t>H=79</m:t>
+                <m:t>ℋ</m:t>
+              </m:r>
+              <m:r>
+                <m:rPr>
+                  <m:sty m:val="p"/>
+                </m:rPr>
+                <m:t>=</m:t>
+              </m:r>
+              <m:r>
+                <m:rPr>
+                  <m:sty m:val="p"/>
+                </m:rPr>
+                <m:t>79</m:t>
               </m:r>
             </m:oMath>
           </w:p>
@@ -3275,7 +4703,19 @@
                 <m:rPr>
                   <m:sty m:val="p"/>
                 </m:rPr>
-                <m:t>H=94</m:t>
+                <m:t>ℋ</m:t>
+              </m:r>
+              <m:r>
+                <m:rPr>
+                  <m:sty m:val="p"/>
+                </m:rPr>
+                <m:t>=</m:t>
+              </m:r>
+              <m:r>
+                <m:rPr>
+                  <m:sty m:val="p"/>
+                </m:rPr>
+                <m:t>94</m:t>
               </m:r>
             </m:oMath>
           </w:p>
@@ -3304,7 +4744,19 @@
                 <m:rPr>
                   <m:sty m:val="p"/>
                 </m:rPr>
-                <m:t>+2.05 \text{ pts/mo}</m:t>
+                <m:t>+</m:t>
+              </m:r>
+              <m:r>
+                <m:rPr>
+                  <m:sty m:val="p"/>
+                </m:rPr>
+                <m:t>2.05</m:t>
+              </m:r>
+              <m:r>
+                <m:rPr>
+                  <m:sty m:val="p"/>
+                </m:rPr>
+                <m:t>pts/mo</m:t>
               </m:r>
             </m:oMath>
           </w:p>
@@ -3397,7 +4849,19 @@
                 <m:rPr>
                   <m:sty m:val="p"/>
                 </m:rPr>
-                <m:t>H=25</m:t>
+                <m:t>ℋ</m:t>
+              </m:r>
+              <m:r>
+                <m:rPr>
+                  <m:sty m:val="p"/>
+                </m:rPr>
+                <m:t>=</m:t>
+              </m:r>
+              <m:r>
+                <m:rPr>
+                  <m:sty m:val="p"/>
+                </m:rPr>
+                <m:t>25</m:t>
               </m:r>
             </m:oMath>
           </w:p>
@@ -3427,7 +4891,19 @@
                 <m:rPr>
                   <m:sty m:val="p"/>
                 </m:rPr>
-                <m:t>H=38</m:t>
+                <m:t>ℋ</m:t>
+              </m:r>
+              <m:r>
+                <m:rPr>
+                  <m:sty m:val="p"/>
+                </m:rPr>
+                <m:t>=</m:t>
+              </m:r>
+              <m:r>
+                <m:rPr>
+                  <m:sty m:val="p"/>
+                </m:rPr>
+                <m:t>38</m:t>
               </m:r>
             </m:oMath>
           </w:p>
@@ -3457,7 +4933,19 @@
                 <m:rPr>
                   <m:sty m:val="p"/>
                 </m:rPr>
-                <m:t>H=36</m:t>
+                <m:t>ℋ</m:t>
+              </m:r>
+              <m:r>
+                <m:rPr>
+                  <m:sty m:val="p"/>
+                </m:rPr>
+                <m:t>=</m:t>
+              </m:r>
+              <m:r>
+                <m:rPr>
+                  <m:sty m:val="p"/>
+                </m:rPr>
+                <m:t>36</m:t>
               </m:r>
             </m:oMath>
           </w:p>
@@ -3487,7 +4975,19 @@
                 <m:rPr>
                   <m:sty m:val="p"/>
                 </m:rPr>
-                <m:t>H=32</m:t>
+                <m:t>ℋ</m:t>
+              </m:r>
+              <m:r>
+                <m:rPr>
+                  <m:sty m:val="p"/>
+                </m:rPr>
+                <m:t>=</m:t>
+              </m:r>
+              <m:r>
+                <m:rPr>
+                  <m:sty m:val="p"/>
+                </m:rPr>
+                <m:t>32</m:t>
               </m:r>
             </m:oMath>
           </w:p>
@@ -3517,7 +5017,19 @@
                 <m:rPr>
                   <m:sty m:val="p"/>
                 </m:rPr>
-                <m:t>-0.17 \text{ pts/mo}</m:t>
+                <m:t>−</m:t>
+              </m:r>
+              <m:r>
+                <m:rPr>
+                  <m:sty m:val="p"/>
+                </m:rPr>
+                <m:t>0.17</m:t>
+              </m:r>
+              <m:r>
+                <m:rPr>
+                  <m:sty m:val="p"/>
+                </m:rPr>
+                <m:t>pts/mo</m:t>
               </m:r>
             </m:oMath>
           </w:p>
@@ -3597,7 +5109,19 @@
           <m:rPr>
             <m:sty m:val="p"/>
           </m:rPr>
-          <m:t>H=94</m:t>
+          <m:t>ℋ</m:t>
+        </m:r>
+        <m:r>
+          <m:rPr>
+            <m:sty m:val="p"/>
+          </m:rPr>
+          <m:t>=</m:t>
+        </m:r>
+        <m:r>
+          <m:rPr>
+            <m:sty m:val="p"/>
+          </m:rPr>
+          <m:t>94</m:t>
         </m:r>
       </m:oMath>
       <w:r>
@@ -3608,11 +5132,47 @@
         <w:t>) and growth velocity (</w:t>
       </w:r>
       <m:oMath>
+        <m:sSub>
+          <m:e>
+            <m:r>
+              <m:rPr>
+                <m:sty m:val="p"/>
+              </m:rPr>
+              <m:t>μ</m:t>
+            </m:r>
+          </m:e>
+          <m:sub>
+            <m:r>
+              <m:rPr>
+                <m:sty m:val="p"/>
+              </m:rPr>
+              <m:t>v</m:t>
+            </m:r>
+          </m:sub>
+        </m:sSub>
         <m:r>
           <m:rPr>
             <m:sty m:val="p"/>
           </m:rPr>
-          <m:t>μv = +2.05 \text{ pts/mo}</m:t>
+          <m:t>=</m:t>
+        </m:r>
+        <m:r>
+          <m:rPr>
+            <m:sty m:val="p"/>
+          </m:rPr>
+          <m:t>+</m:t>
+        </m:r>
+        <m:r>
+          <m:rPr>
+            <m:sty m:val="p"/>
+          </m:rPr>
+          <m:t>2.05</m:t>
+        </m:r>
+        <m:r>
+          <m:rPr>
+            <m:sty m:val="p"/>
+          </m:rPr>
+          <m:t>pts/mo</m:t>
         </m:r>
       </m:oMath>
       <w:r>
@@ -3715,15 +5275,111 @@
           <w:rFonts w:ascii="Times New Roman" w:hAnsi="Times New Roman"/>
           <w:sz w:val="22"/>
         </w:rPr>
-        <w:t xml:space="preserve">To evaluate the mathematical stability of the exponential decay model Eq. (3), we varied the decay parameter </w:t>
+        <w:t xml:space="preserve">To evaluate the mathematical stability of the exponential decay model [Eq. 3], we varied the decay parameter </w:t>
       </w:r>
       <m:oMath>
         <m:r>
           <m:rPr>
             <m:sty m:val="p"/>
           </m:rPr>
-          <m:t>λ ∈ [0.01, 0.02, 0.03, 0.04, 0.05] \text{ month}^{-1}</m:t>
+          <m:t>λ</m:t>
         </m:r>
+        <m:r>
+          <m:rPr>
+            <m:sty m:val="p"/>
+          </m:rPr>
+          <m:t>∈</m:t>
+        </m:r>
+        <m:r>
+          <m:rPr>
+            <m:sty m:val="p"/>
+          </m:rPr>
+          <m:t>[</m:t>
+        </m:r>
+        <m:r>
+          <m:rPr>
+            <m:sty m:val="p"/>
+          </m:rPr>
+          <m:t>0.01</m:t>
+        </m:r>
+        <m:r>
+          <m:rPr>
+            <m:sty m:val="p"/>
+          </m:rPr>
+          <m:t>,</m:t>
+        </m:r>
+        <m:r>
+          <m:rPr>
+            <m:sty m:val="p"/>
+          </m:rPr>
+          <m:t>0.02</m:t>
+        </m:r>
+        <m:r>
+          <m:rPr>
+            <m:sty m:val="p"/>
+          </m:rPr>
+          <m:t>,</m:t>
+        </m:r>
+        <m:r>
+          <m:rPr>
+            <m:sty m:val="p"/>
+          </m:rPr>
+          <m:t>0.03</m:t>
+        </m:r>
+        <m:r>
+          <m:rPr>
+            <m:sty m:val="p"/>
+          </m:rPr>
+          <m:t>,</m:t>
+        </m:r>
+        <m:r>
+          <m:rPr>
+            <m:sty m:val="p"/>
+          </m:rPr>
+          <m:t>0.04</m:t>
+        </m:r>
+        <m:r>
+          <m:rPr>
+            <m:sty m:val="p"/>
+          </m:rPr>
+          <m:t>,</m:t>
+        </m:r>
+        <m:r>
+          <m:rPr>
+            <m:sty m:val="p"/>
+          </m:rPr>
+          <m:t>0.05</m:t>
+        </m:r>
+        <m:r>
+          <m:rPr>
+            <m:sty m:val="p"/>
+          </m:rPr>
+          <m:t>]</m:t>
+        </m:r>
+        <m:sSup>
+          <m:e>
+            <m:r>
+              <m:rPr>
+                <m:sty m:val="p"/>
+              </m:rPr>
+              <m:t>month</m:t>
+            </m:r>
+          </m:e>
+          <m:sup>
+            <m:r>
+              <m:rPr>
+                <m:sty m:val="p"/>
+              </m:rPr>
+              <m:t>−</m:t>
+            </m:r>
+            <m:r>
+              <m:rPr>
+                <m:sty m:val="p"/>
+              </m:rPr>
+              <m:t>1</m:t>
+            </m:r>
+          </m:sup>
+        </m:sSup>
       </m:oMath>
       <w:r>
         <w:rPr>
@@ -3733,11 +5389,41 @@
         <w:t xml:space="preserve"> across an initial proficiency </w:t>
       </w:r>
       <m:oMath>
+        <m:sSub>
+          <m:e>
+            <m:r>
+              <m:rPr>
+                <m:sty m:val="p"/>
+              </m:rPr>
+              <m:t>S</m:t>
+            </m:r>
+          </m:e>
+          <m:sub>
+            <m:r>
+              <m:rPr>
+                <m:sty m:val="p"/>
+              </m:rPr>
+              <m:t>0</m:t>
+            </m:r>
+          </m:sub>
+        </m:sSub>
         <m:r>
           <m:rPr>
             <m:sty m:val="p"/>
           </m:rPr>
-          <m:t>S₀ = 80\%</m:t>
+          <m:t>=</m:t>
+        </m:r>
+        <m:r>
+          <m:rPr>
+            <m:sty m:val="p"/>
+          </m:rPr>
+          <m:t>80</m:t>
+        </m:r>
+        <m:r>
+          <m:rPr>
+            <m:sty m:val="p"/>
+          </m:rPr>
+          <m:t>%</m:t>
         </m:r>
       </m:oMath>
       <w:r>
@@ -3752,7 +5438,55 @@
           <m:rPr>
             <m:sty m:val="p"/>
           </m:rPr>
-          <m:t>6, 12, 18, \text{ and } 24 \text{ months}</m:t>
+          <m:t>6</m:t>
+        </m:r>
+        <m:r>
+          <m:rPr>
+            <m:sty m:val="p"/>
+          </m:rPr>
+          <m:t>,</m:t>
+        </m:r>
+        <m:r>
+          <m:rPr>
+            <m:sty m:val="p"/>
+          </m:rPr>
+          <m:t>12</m:t>
+        </m:r>
+        <m:r>
+          <m:rPr>
+            <m:sty m:val="p"/>
+          </m:rPr>
+          <m:t>,</m:t>
+        </m:r>
+        <m:r>
+          <m:rPr>
+            <m:sty m:val="p"/>
+          </m:rPr>
+          <m:t>18</m:t>
+        </m:r>
+        <m:r>
+          <m:rPr>
+            <m:sty m:val="p"/>
+          </m:rPr>
+          <m:t>,</m:t>
+        </m:r>
+        <m:r>
+          <m:rPr>
+            <m:sty m:val="p"/>
+          </m:rPr>
+          <m:t>and</m:t>
+        </m:r>
+        <m:r>
+          <m:rPr>
+            <m:sty m:val="p"/>
+          </m:rPr>
+          <m:t>24</m:t>
+        </m:r>
+        <m:r>
+          <m:rPr>
+            <m:sty m:val="p"/>
+          </m:rPr>
+          <m:t>months</m:t>
         </m:r>
       </m:oMath>
       <w:r>
@@ -3790,7 +5524,25 @@
           <m:rPr>
             <m:sty m:val="p"/>
           </m:rPr>
-          <m:t>S(t)</m:t>
+          <m:t>S</m:t>
+        </m:r>
+        <m:r>
+          <m:rPr>
+            <m:sty m:val="p"/>
+          </m:rPr>
+          <m:t>(</m:t>
+        </m:r>
+        <m:r>
+          <m:rPr>
+            <m:sty m:val="p"/>
+          </m:rPr>
+          <m:t>t</m:t>
+        </m:r>
+        <m:r>
+          <m:rPr>
+            <m:sty m:val="p"/>
+          </m:rPr>
+          <m:t>)</m:t>
         </m:r>
       </m:oMath>
       <w:r>
@@ -3816,11 +5568,41 @@
         <w:t xml:space="preserve"> Coefficients (</w:t>
       </w:r>
       <m:oMath>
+        <m:sSub>
+          <m:e>
+            <m:r>
+              <m:rPr>
+                <m:sty m:val="p"/>
+              </m:rPr>
+              <m:t>S</m:t>
+            </m:r>
+          </m:e>
+          <m:sub>
+            <m:r>
+              <m:rPr>
+                <m:sty m:val="p"/>
+              </m:rPr>
+              <m:t>0</m:t>
+            </m:r>
+          </m:sub>
+        </m:sSub>
         <m:r>
           <m:rPr>
             <m:sty m:val="p"/>
           </m:rPr>
-          <m:t>S₀ = 80\%</m:t>
+          <m:t>=</m:t>
+        </m:r>
+        <m:r>
+          <m:rPr>
+            <m:sty m:val="p"/>
+          </m:rPr>
+          <m:t>80</m:t>
+        </m:r>
+        <m:r>
+          <m:rPr>
+            <m:sty m:val="p"/>
+          </m:rPr>
+          <m:t>%</m:t>
         </m:r>
       </m:oMath>
       <w:r>
@@ -4072,12 +5854,36 @@
               <w:t>Half-Life (</w:t>
             </w:r>
             <m:oMath>
-              <m:r>
-                <m:rPr>
-                  <m:sty m:val="p"/>
-                </m:rPr>
-                <m:t>t₁⁄₂</m:t>
-              </m:r>
+              <m:sSub>
+                <m:e>
+                  <m:r>
+                    <m:rPr>
+                      <m:sty m:val="p"/>
+                    </m:rPr>
+                    <m:t>t</m:t>
+                  </m:r>
+                </m:e>
+                <m:sub>
+                  <m:r>
+                    <m:rPr>
+                      <m:sty m:val="p"/>
+                    </m:rPr>
+                    <m:t>1</m:t>
+                  </m:r>
+                  <m:r>
+                    <m:rPr>
+                      <m:sty m:val="p"/>
+                    </m:rPr>
+                    <m:t>/</m:t>
+                  </m:r>
+                  <m:r>
+                    <m:rPr>
+                      <m:sty m:val="p"/>
+                    </m:rPr>
+                    <m:t>2</m:t>
+                  </m:r>
+                </m:sub>
+              </m:sSub>
             </m:oMath>
             <w:r>
               <w:rPr>
@@ -4120,7 +5926,25 @@
                 <m:rPr>
                   <m:sty m:val="p"/>
                 </m:rPr>
-                <m:t>λ = 0.01 \text{ (Slow)}</m:t>
+                <m:t>λ</m:t>
+              </m:r>
+              <m:r>
+                <m:rPr>
+                  <m:sty m:val="p"/>
+                </m:rPr>
+                <m:t>=</m:t>
+              </m:r>
+              <m:r>
+                <m:rPr>
+                  <m:sty m:val="p"/>
+                </m:rPr>
+                <m:t>0.01</m:t>
+              </m:r>
+              <m:r>
+                <m:rPr>
+                  <m:sty m:val="p"/>
+                </m:rPr>
+                <m:t>(Slow)</m:t>
               </m:r>
             </m:oMath>
           </w:p>
@@ -4150,7 +5974,13 @@
                 <m:rPr>
                   <m:sty m:val="p"/>
                 </m:rPr>
-                <m:t>75.3\%</m:t>
+                <m:t>75.3</m:t>
+              </m:r>
+              <m:r>
+                <m:rPr>
+                  <m:sty m:val="p"/>
+                </m:rPr>
+                <m:t>%</m:t>
               </m:r>
             </m:oMath>
           </w:p>
@@ -4180,7 +6010,13 @@
                 <m:rPr>
                   <m:sty m:val="p"/>
                 </m:rPr>
-                <m:t>70.9\%</m:t>
+                <m:t>70.9</m:t>
+              </m:r>
+              <m:r>
+                <m:rPr>
+                  <m:sty m:val="p"/>
+                </m:rPr>
+                <m:t>%</m:t>
               </m:r>
             </m:oMath>
           </w:p>
@@ -4210,7 +6046,13 @@
                 <m:rPr>
                   <m:sty m:val="p"/>
                 </m:rPr>
-                <m:t>66.8\%</m:t>
+                <m:t>66.8</m:t>
+              </m:r>
+              <m:r>
+                <m:rPr>
+                  <m:sty m:val="p"/>
+                </m:rPr>
+                <m:t>%</m:t>
               </m:r>
             </m:oMath>
           </w:p>
@@ -4240,7 +6082,13 @@
                 <m:rPr>
                   <m:sty m:val="p"/>
                 </m:rPr>
-                <m:t>62.9\%</m:t>
+                <m:t>62.9</m:t>
+              </m:r>
+              <m:r>
+                <m:rPr>
+                  <m:sty m:val="p"/>
+                </m:rPr>
+                <m:t>%</m:t>
               </m:r>
             </m:oMath>
           </w:p>
@@ -4270,7 +6118,13 @@
                 <m:rPr>
                   <m:sty m:val="p"/>
                 </m:rPr>
-                <m:t>69.3 \text{ months}</m:t>
+                <m:t>69.3</m:t>
+              </m:r>
+              <m:r>
+                <m:rPr>
+                  <m:sty m:val="p"/>
+                </m:rPr>
+                <m:t>months</m:t>
               </m:r>
             </m:oMath>
           </w:p>
@@ -4304,7 +6158,25 @@
                 <m:rPr>
                   <m:sty m:val="p"/>
                 </m:rPr>
-                <m:t>λ = 0.02 \text{ (Moderate)}</m:t>
+                <m:t>λ</m:t>
+              </m:r>
+              <m:r>
+                <m:rPr>
+                  <m:sty m:val="p"/>
+                </m:rPr>
+                <m:t>=</m:t>
+              </m:r>
+              <m:r>
+                <m:rPr>
+                  <m:sty m:val="p"/>
+                </m:rPr>
+                <m:t>0.02</m:t>
+              </m:r>
+              <m:r>
+                <m:rPr>
+                  <m:sty m:val="p"/>
+                </m:rPr>
+                <m:t>(Moderate)</m:t>
               </m:r>
             </m:oMath>
           </w:p>
@@ -4333,7 +6205,13 @@
                 <m:rPr>
                   <m:sty m:val="p"/>
                 </m:rPr>
-                <m:t>70.9\%</m:t>
+                <m:t>70.9</m:t>
+              </m:r>
+              <m:r>
+                <m:rPr>
+                  <m:sty m:val="p"/>
+                </m:rPr>
+                <m:t>%</m:t>
               </m:r>
             </m:oMath>
           </w:p>
@@ -4362,7 +6240,13 @@
                 <m:rPr>
                   <m:sty m:val="p"/>
                 </m:rPr>
-                <m:t>62.9\%</m:t>
+                <m:t>62.9</m:t>
+              </m:r>
+              <m:r>
+                <m:rPr>
+                  <m:sty m:val="p"/>
+                </m:rPr>
+                <m:t>%</m:t>
               </m:r>
             </m:oMath>
           </w:p>
@@ -4391,7 +6275,13 @@
                 <m:rPr>
                   <m:sty m:val="p"/>
                 </m:rPr>
-                <m:t>55.8\%</m:t>
+                <m:t>55.8</m:t>
+              </m:r>
+              <m:r>
+                <m:rPr>
+                  <m:sty m:val="p"/>
+                </m:rPr>
+                <m:t>%</m:t>
               </m:r>
             </m:oMath>
           </w:p>
@@ -4420,7 +6310,13 @@
                 <m:rPr>
                   <m:sty m:val="p"/>
                 </m:rPr>
-                <m:t>49.5\%</m:t>
+                <m:t>49.5</m:t>
+              </m:r>
+              <m:r>
+                <m:rPr>
+                  <m:sty m:val="p"/>
+                </m:rPr>
+                <m:t>%</m:t>
               </m:r>
             </m:oMath>
           </w:p>
@@ -4449,7 +6345,13 @@
                 <m:rPr>
                   <m:sty m:val="p"/>
                 </m:rPr>
-                <m:t>34.7 \text{ months}</m:t>
+                <m:t>34.7</m:t>
+              </m:r>
+              <m:r>
+                <m:rPr>
+                  <m:sty m:val="p"/>
+                </m:rPr>
+                <m:t>months</m:t>
               </m:r>
             </m:oMath>
           </w:p>
@@ -4484,7 +6386,25 @@
                 <m:rPr>
                   <m:sty m:val="p"/>
                 </m:rPr>
-                <m:t>λ = 0.03 \text{ (Baseline)}</m:t>
+                <m:t>λ</m:t>
+              </m:r>
+              <m:r>
+                <m:rPr>
+                  <m:sty m:val="p"/>
+                </m:rPr>
+                <m:t>=</m:t>
+              </m:r>
+              <m:r>
+                <m:rPr>
+                  <m:sty m:val="p"/>
+                </m:rPr>
+                <m:t>0.03</m:t>
+              </m:r>
+              <m:r>
+                <m:rPr>
+                  <m:sty m:val="p"/>
+                </m:rPr>
+                <m:t>(Baseline)</m:t>
               </m:r>
             </m:oMath>
           </w:p>
@@ -4514,7 +6434,13 @@
                 <m:rPr>
                   <m:sty m:val="p"/>
                 </m:rPr>
-                <m:t>66.8\%</m:t>
+                <m:t>66.8</m:t>
+              </m:r>
+              <m:r>
+                <m:rPr>
+                  <m:sty m:val="p"/>
+                </m:rPr>
+                <m:t>%</m:t>
               </m:r>
             </m:oMath>
           </w:p>
@@ -4544,7 +6470,13 @@
                 <m:rPr>
                   <m:sty m:val="p"/>
                 </m:rPr>
-                <m:t>55.8\%</m:t>
+                <m:t>55.8</m:t>
+              </m:r>
+              <m:r>
+                <m:rPr>
+                  <m:sty m:val="p"/>
+                </m:rPr>
+                <m:t>%</m:t>
               </m:r>
             </m:oMath>
           </w:p>
@@ -4574,7 +6506,13 @@
                 <m:rPr>
                   <m:sty m:val="p"/>
                 </m:rPr>
-                <m:t>46.6\%</m:t>
+                <m:t>46.6</m:t>
+              </m:r>
+              <m:r>
+                <m:rPr>
+                  <m:sty m:val="p"/>
+                </m:rPr>
+                <m:t>%</m:t>
               </m:r>
             </m:oMath>
           </w:p>
@@ -4604,7 +6542,13 @@
                 <m:rPr>
                   <m:sty m:val="p"/>
                 </m:rPr>
-                <m:t>38.9\%</m:t>
+                <m:t>38.9</m:t>
+              </m:r>
+              <m:r>
+                <m:rPr>
+                  <m:sty m:val="p"/>
+                </m:rPr>
+                <m:t>%</m:t>
               </m:r>
             </m:oMath>
           </w:p>
@@ -4634,7 +6578,13 @@
                 <m:rPr>
                   <m:sty m:val="p"/>
                 </m:rPr>
-                <m:t>23.1 \text{ months}</m:t>
+                <m:t>23.1</m:t>
+              </m:r>
+              <m:r>
+                <m:rPr>
+                  <m:sty m:val="p"/>
+                </m:rPr>
+                <m:t>months</m:t>
               </m:r>
             </m:oMath>
           </w:p>
@@ -4668,7 +6618,25 @@
                 <m:rPr>
                   <m:sty m:val="p"/>
                 </m:rPr>
-                <m:t>λ = 0.04 \text{ (Fast)}</m:t>
+                <m:t>λ</m:t>
+              </m:r>
+              <m:r>
+                <m:rPr>
+                  <m:sty m:val="p"/>
+                </m:rPr>
+                <m:t>=</m:t>
+              </m:r>
+              <m:r>
+                <m:rPr>
+                  <m:sty m:val="p"/>
+                </m:rPr>
+                <m:t>0.04</m:t>
+              </m:r>
+              <m:r>
+                <m:rPr>
+                  <m:sty m:val="p"/>
+                </m:rPr>
+                <m:t>(Fast)</m:t>
               </m:r>
             </m:oMath>
           </w:p>
@@ -4697,7 +6665,13 @@
                 <m:rPr>
                   <m:sty m:val="p"/>
                 </m:rPr>
-                <m:t>62.9\%</m:t>
+                <m:t>62.9</m:t>
+              </m:r>
+              <m:r>
+                <m:rPr>
+                  <m:sty m:val="p"/>
+                </m:rPr>
+                <m:t>%</m:t>
               </m:r>
             </m:oMath>
           </w:p>
@@ -4726,7 +6700,13 @@
                 <m:rPr>
                   <m:sty m:val="p"/>
                 </m:rPr>
-                <m:t>49.5\%</m:t>
+                <m:t>49.5</m:t>
+              </m:r>
+              <m:r>
+                <m:rPr>
+                  <m:sty m:val="p"/>
+                </m:rPr>
+                <m:t>%</m:t>
               </m:r>
             </m:oMath>
           </w:p>
@@ -4755,7 +6735,13 @@
                 <m:rPr>
                   <m:sty m:val="p"/>
                 </m:rPr>
-                <m:t>38.9\%</m:t>
+                <m:t>38.9</m:t>
+              </m:r>
+              <m:r>
+                <m:rPr>
+                  <m:sty m:val="p"/>
+                </m:rPr>
+                <m:t>%</m:t>
               </m:r>
             </m:oMath>
           </w:p>
@@ -4784,7 +6770,13 @@
                 <m:rPr>
                   <m:sty m:val="p"/>
                 </m:rPr>
-                <m:t>30.6\%</m:t>
+                <m:t>30.6</m:t>
+              </m:r>
+              <m:r>
+                <m:rPr>
+                  <m:sty m:val="p"/>
+                </m:rPr>
+                <m:t>%</m:t>
               </m:r>
             </m:oMath>
           </w:p>
@@ -4813,7 +6805,13 @@
                 <m:rPr>
                   <m:sty m:val="p"/>
                 </m:rPr>
-                <m:t>17.3 \text{ months}</m:t>
+                <m:t>17.3</m:t>
+              </m:r>
+              <m:r>
+                <m:rPr>
+                  <m:sty m:val="p"/>
+                </m:rPr>
+                <m:t>months</m:t>
               </m:r>
             </m:oMath>
           </w:p>
@@ -4848,7 +6846,25 @@
                 <m:rPr>
                   <m:sty m:val="p"/>
                 </m:rPr>
-                <m:t>λ = 0.05 \text{ (Aggressive)}</m:t>
+                <m:t>λ</m:t>
+              </m:r>
+              <m:r>
+                <m:rPr>
+                  <m:sty m:val="p"/>
+                </m:rPr>
+                <m:t>=</m:t>
+              </m:r>
+              <m:r>
+                <m:rPr>
+                  <m:sty m:val="p"/>
+                </m:rPr>
+                <m:t>0.05</m:t>
+              </m:r>
+              <m:r>
+                <m:rPr>
+                  <m:sty m:val="p"/>
+                </m:rPr>
+                <m:t>(Aggressive)</m:t>
               </m:r>
             </m:oMath>
           </w:p>
@@ -4878,7 +6894,13 @@
                 <m:rPr>
                   <m:sty m:val="p"/>
                 </m:rPr>
-                <m:t>59.3\%</m:t>
+                <m:t>59.3</m:t>
+              </m:r>
+              <m:r>
+                <m:rPr>
+                  <m:sty m:val="p"/>
+                </m:rPr>
+                <m:t>%</m:t>
               </m:r>
             </m:oMath>
           </w:p>
@@ -4908,7 +6930,13 @@
                 <m:rPr>
                   <m:sty m:val="p"/>
                 </m:rPr>
-                <m:t>43.9\%</m:t>
+                <m:t>43.9</m:t>
+              </m:r>
+              <m:r>
+                <m:rPr>
+                  <m:sty m:val="p"/>
+                </m:rPr>
+                <m:t>%</m:t>
               </m:r>
             </m:oMath>
           </w:p>
@@ -4938,7 +6966,13 @@
                 <m:rPr>
                   <m:sty m:val="p"/>
                 </m:rPr>
-                <m:t>32.5\%</m:t>
+                <m:t>32.5</m:t>
+              </m:r>
+              <m:r>
+                <m:rPr>
+                  <m:sty m:val="p"/>
+                </m:rPr>
+                <m:t>%</m:t>
               </m:r>
             </m:oMath>
           </w:p>
@@ -4968,7 +7002,13 @@
                 <m:rPr>
                   <m:sty m:val="p"/>
                 </m:rPr>
-                <m:t>24.1\%</m:t>
+                <m:t>24.1</m:t>
+              </m:r>
+              <m:r>
+                <m:rPr>
+                  <m:sty m:val="p"/>
+                </m:rPr>
+                <m:t>%</m:t>
               </m:r>
             </m:oMath>
           </w:p>
@@ -4998,7 +7038,13 @@
                 <m:rPr>
                   <m:sty m:val="p"/>
                 </m:rPr>
-                <m:t>13.9 \text{ months}</m:t>
+                <m:t>13.9</m:t>
+              </m:r>
+              <m:r>
+                <m:rPr>
+                  <m:sty m:val="p"/>
+                </m:rPr>
+                <m:t>months</m:t>
               </m:r>
             </m:oMath>
           </w:p>
@@ -5091,8 +7137,44 @@
           <m:rPr>
             <m:sty m:val="p"/>
           </m:rPr>
-          <m:t>λ = 0.03 \text{ month}^{-1}</m:t>
+          <m:t>λ</m:t>
         </m:r>
+        <m:r>
+          <m:rPr>
+            <m:sty m:val="p"/>
+          </m:rPr>
+          <m:t>=</m:t>
+        </m:r>
+        <m:r>
+          <m:rPr>
+            <m:sty m:val="p"/>
+          </m:rPr>
+          <m:t>0.03</m:t>
+        </m:r>
+        <m:sSup>
+          <m:e>
+            <m:r>
+              <m:rPr>
+                <m:sty m:val="p"/>
+              </m:rPr>
+              <m:t>month</m:t>
+            </m:r>
+          </m:e>
+          <m:sup>
+            <m:r>
+              <m:rPr>
+                <m:sty m:val="p"/>
+              </m:rPr>
+              <m:t>−</m:t>
+            </m:r>
+            <m:r>
+              <m:rPr>
+                <m:sty m:val="p"/>
+              </m:rPr>
+              <m:t>1</m:t>
+            </m:r>
+          </m:sup>
+        </m:sSup>
       </m:oMath>
       <w:r>
         <w:rPr>
@@ -5102,11 +7184,53 @@
         <w:t xml:space="preserve"> yields a half-life </w:t>
       </w:r>
       <m:oMath>
+        <m:sSub>
+          <m:e>
+            <m:r>
+              <m:rPr>
+                <m:sty m:val="p"/>
+              </m:rPr>
+              <m:t>t</m:t>
+            </m:r>
+          </m:e>
+          <m:sub>
+            <m:r>
+              <m:rPr>
+                <m:sty m:val="p"/>
+              </m:rPr>
+              <m:t>1</m:t>
+            </m:r>
+            <m:r>
+              <m:rPr>
+                <m:sty m:val="p"/>
+              </m:rPr>
+              <m:t>/</m:t>
+            </m:r>
+            <m:r>
+              <m:rPr>
+                <m:sty m:val="p"/>
+              </m:rPr>
+              <m:t>2</m:t>
+            </m:r>
+          </m:sub>
+        </m:sSub>
         <m:r>
           <m:rPr>
             <m:sty m:val="p"/>
           </m:rPr>
-          <m:t>t₁⁄₂ = 23.1 \text{ months}</m:t>
+          <m:t>=</m:t>
+        </m:r>
+        <m:r>
+          <m:rPr>
+            <m:sty m:val="p"/>
+          </m:rPr>
+          <m:t>23.1</m:t>
+        </m:r>
+        <m:r>
+          <m:rPr>
+            <m:sty m:val="p"/>
+          </m:rPr>
+          <m:t>months</m:t>
         </m:r>
       </m:oMath>
       <w:r>
@@ -5219,7 +7343,25 @@
           <m:rPr>
             <m:sty m:val="p"/>
           </m:rPr>
-          <m:t>S = 15\%</m:t>
+          <m:t>S</m:t>
+        </m:r>
+        <m:r>
+          <m:rPr>
+            <m:sty m:val="p"/>
+          </m:rPr>
+          <m:t>=</m:t>
+        </m:r>
+        <m:r>
+          <m:rPr>
+            <m:sty m:val="p"/>
+          </m:rPr>
+          <m:t>15</m:t>
+        </m:r>
+        <m:r>
+          <m:rPr>
+            <m:sty m:val="p"/>
+          </m:rPr>
+          <m:t>%</m:t>
         </m:r>
       </m:oMath>
       <w:r>
@@ -5234,7 +7376,25 @@
           <m:rPr>
             <m:sty m:val="p"/>
           </m:rPr>
-          <m:t>C = 46\%</m:t>
+          <m:t>C</m:t>
+        </m:r>
+        <m:r>
+          <m:rPr>
+            <m:sty m:val="p"/>
+          </m:rPr>
+          <m:t>=</m:t>
+        </m:r>
+        <m:r>
+          <m:rPr>
+            <m:sty m:val="p"/>
+          </m:rPr>
+          <m:t>46</m:t>
+        </m:r>
+        <m:r>
+          <m:rPr>
+            <m:sty m:val="p"/>
+          </m:rPr>
+          <m:t>%</m:t>
         </m:r>
       </m:oMath>
       <w:r>
@@ -5303,7 +7463,25 @@
           <m:rPr>
             <m:sty m:val="p"/>
           </m:rPr>
-          <m:t>S = 75\%</m:t>
+          <m:t>S</m:t>
+        </m:r>
+        <m:r>
+          <m:rPr>
+            <m:sty m:val="p"/>
+          </m:rPr>
+          <m:t>=</m:t>
+        </m:r>
+        <m:r>
+          <m:rPr>
+            <m:sty m:val="p"/>
+          </m:rPr>
+          <m:t>75</m:t>
+        </m:r>
+        <m:r>
+          <m:rPr>
+            <m:sty m:val="p"/>
+          </m:rPr>
+          <m:t>%</m:t>
         </m:r>
       </m:oMath>
       <w:r>
@@ -5318,7 +7496,25 @@
           <m:rPr>
             <m:sty m:val="p"/>
           </m:rPr>
-          <m:t>C = 85\%</m:t>
+          <m:t>C</m:t>
+        </m:r>
+        <m:r>
+          <m:rPr>
+            <m:sty m:val="p"/>
+          </m:rPr>
+          <m:t>=</m:t>
+        </m:r>
+        <m:r>
+          <m:rPr>
+            <m:sty m:val="p"/>
+          </m:rPr>
+          <m:t>85</m:t>
+        </m:r>
+        <m:r>
+          <m:rPr>
+            <m:sty m:val="p"/>
+          </m:rPr>
+          <m:t>%</m:t>
         </m:r>
       </m:oMath>
       <w:r>
@@ -5372,7 +7568,19 @@
           <m:rPr>
             <m:sty m:val="p"/>
           </m:rPr>
-          <m:t>H = 88</m:t>
+          <m:t>ℋ</m:t>
+        </m:r>
+        <m:r>
+          <m:rPr>
+            <m:sty m:val="p"/>
+          </m:rPr>
+          <m:t>=</m:t>
+        </m:r>
+        <m:r>
+          <m:rPr>
+            <m:sty m:val="p"/>
+          </m:rPr>
+          <m:t>88</m:t>
         </m:r>
       </m:oMath>
       <w:r>
@@ -5605,7 +7813,19 @@
           <m:rPr>
             <m:sty m:val="p"/>
           </m:rPr>
-          <m:t>N=5</m:t>
+          <m:t>N</m:t>
+        </m:r>
+        <m:r>
+          <m:rPr>
+            <m:sty m:val="p"/>
+          </m:rPr>
+          <m:t>=</m:t>
+        </m:r>
+        <m:r>
+          <m:rPr>
+            <m:sty m:val="p"/>
+          </m:rPr>
+          <m:t>5</m:t>
         </m:r>
       </m:oMath>
       <w:r>
@@ -5641,12 +7861,24 @@
         <w:t>Model weights (</w:t>
       </w:r>
       <m:oMath>
-        <m:r>
-          <m:rPr>
-            <m:sty m:val="p"/>
-          </m:rPr>
-          <m:t>W_{\text{source}}</m:t>
-        </m:r>
+        <m:sSub>
+          <m:e>
+            <m:r>
+              <m:rPr>
+                <m:sty m:val="p"/>
+              </m:rPr>
+              <m:t>W</m:t>
+            </m:r>
+          </m:e>
+          <m:sub>
+            <m:r>
+              <m:rPr>
+                <m:sty m:val="p"/>
+              </m:rPr>
+              <m:t>source</m:t>
+            </m:r>
+          </m:sub>
+        </m:sSub>
       </m:oMath>
       <w:r>
         <w:rPr>
@@ -5656,12 +7888,24 @@
         <w:t>) and taxonomy categories are currently optimized for Computer Science and Software Engineering disciplines. Extending Academic Universe to disciplines such as Mechanical Engineering, Biotechnology, or Business Administration requires recalibrating domain curriculum weights (</w:t>
       </w:r>
       <m:oMath>
-        <m:r>
-          <m:rPr>
-            <m:sty m:val="p"/>
-          </m:rPr>
-          <m:t>w_k</m:t>
-        </m:r>
+        <m:sSub>
+          <m:e>
+            <m:r>
+              <m:rPr>
+                <m:sty m:val="p"/>
+              </m:rPr>
+              <m:t>w</m:t>
+            </m:r>
+          </m:e>
+          <m:sub>
+            <m:r>
+              <m:rPr>
+                <m:sty m:val="p"/>
+              </m:rPr>
+              <m:t>k</m:t>
+            </m:r>
+          </m:sub>
+        </m:sSub>
       </m:oMath>
       <w:r>
         <w:rPr>
@@ -5725,7 +7969,19 @@
           <m:rPr>
             <m:sty m:val="p"/>
           </m:rPr>
-          <m:t>W=1.00</m:t>
+          <m:t>W</m:t>
+        </m:r>
+        <m:r>
+          <m:rPr>
+            <m:sty m:val="p"/>
+          </m:rPr>
+          <m:t>=</m:t>
+        </m:r>
+        <m:r>
+          <m:rPr>
+            <m:sty m:val="p"/>
+          </m:rPr>
+          <m:t>1.00</m:t>
         </m:r>
       </m:oMath>
       <w:r>
@@ -5795,7 +8051,19 @@
           <m:rPr>
             <m:sty m:val="p"/>
           </m:rPr>
-          <m:t>N ≥ 500</m:t>
+          <m:t>N</m:t>
+        </m:r>
+        <m:r>
+          <m:rPr>
+            <m:sty m:val="p"/>
+          </m:rPr>
+          <m:t>≥</m:t>
+        </m:r>
+        <m:r>
+          <m:rPr>
+            <m:sty m:val="p"/>
+          </m:rPr>
+          <m:t>500</m:t>
         </m:r>
       </m:oMath>
       <w:r>
@@ -5984,86 +8252,6 @@
           <w:sz w:val="23"/>
         </w:rPr>
         <w:t>Manuscript Version 1.0 (Feature Frozen &amp; Publication Ready)</w:t>
-      </w:r>
-    </w:p>
-    <w:p/>
-    <w:p>
-      <w:pPr>
-        <w:keepNext/>
-      </w:pPr>
-      <w:r>
-        <w:rPr>
-          <w:rFonts w:ascii="Times New Roman" w:hAnsi="Times New Roman"/>
-          <w:b/>
-          <w:color w:val="1E3A8A"/>
-          <w:sz w:val="22"/>
-        </w:rPr>
-        <w:t>Foundational Literature Additions (IEEE / ACM Learning Analytics Corpus):</w:t>
-      </w:r>
-    </w:p>
-    <w:p>
-      <w:pPr>
-        <w:spacing w:after="80"/>
-        <w:ind w:left="360"/>
-      </w:pPr>
-      <w:r>
-        <w:rPr>
-          <w:rFonts w:ascii="Times New Roman" w:hAnsi="Times New Roman"/>
-          <w:sz w:val="20"/>
-        </w:rPr>
-        <w:t>5. Corbett, A. T., &amp; Anderson, J. R. (1994). Knowledge tracing: Modeling the acquisition of procedural knowledge. User Modeling and User-Adapted Interaction, 4(4), 253-278.</w:t>
-      </w:r>
-    </w:p>
-    <w:p>
-      <w:pPr>
-        <w:spacing w:after="80"/>
-        <w:ind w:left="360"/>
-      </w:pPr>
-      <w:r>
-        <w:rPr>
-          <w:rFonts w:ascii="Times New Roman" w:hAnsi="Times New Roman"/>
-          <w:sz w:val="20"/>
-        </w:rPr>
-        <w:t>6. Piech, C., Bassen, J., Huang, J., Ganguli, S., Sahami, M., Guibas, L. J., &amp; Sohl-Dickstein, J. (2015). Deep knowledge tracing. Advances in Neural Information Processing Systems (NeurIPS), 28, 505-513.</w:t>
-      </w:r>
-    </w:p>
-    <w:p>
-      <w:pPr>
-        <w:spacing w:after="80"/>
-        <w:ind w:left="360"/>
-      </w:pPr>
-      <w:r>
-        <w:rPr>
-          <w:rFonts w:ascii="Times New Roman" w:hAnsi="Times New Roman"/>
-          <w:sz w:val="20"/>
-        </w:rPr>
-        <w:t>7. Bodily, R., &amp; Verbert, K. (2017). Review of research on student-facing learning analytics dashboards. Journal of Learning Analytics, 4(3), 67-89.</w:t>
-      </w:r>
-    </w:p>
-    <w:p>
-      <w:pPr>
-        <w:spacing w:after="80"/>
-        <w:ind w:left="360"/>
-      </w:pPr>
-      <w:r>
-        <w:rPr>
-          <w:rFonts w:ascii="Times New Roman" w:hAnsi="Times New Roman"/>
-          <w:sz w:val="20"/>
-        </w:rPr>
-        <w:t>8. Ferguson, R. (2012). Learning analytics: Drivers, developments and challenges. International Journal of Technology Enhanced Learning, 4(5-6), 304-317.</w:t>
-      </w:r>
-    </w:p>
-    <w:p>
-      <w:pPr>
-        <w:spacing w:after="80"/>
-        <w:ind w:left="360"/>
-      </w:pPr>
-      <w:r>
-        <w:rPr>
-          <w:rFonts w:ascii="Times New Roman" w:hAnsi="Times New Roman"/>
-          <w:sz w:val="20"/>
-        </w:rPr>
-        <w:t>9. Jivet, I., Scheffel, M., Specht, M., &amp; Drachsler, H. (2018). License to evaluate: Preparing learning analytics dashboards for educational practice. Proceedings of the 8th International Conference on Learning Analytics &amp; Knowledge (LAK '18), 31-40.</w:t>
       </w:r>
     </w:p>
     <w:sectPr>

</xml_diff>